<commit_message>
Updated comments to proposal
</commit_message>
<xml_diff>
--- a/ms/proposal.docx
+++ b/ms/proposal.docx
@@ -10,16 +10,7 @@
     <w:p/>
     <w:p>
       <w:r>
-        <w:t xml:space="preserve">We would like to </w:t>
-      </w:r>
-      <w:r>
-        <w:t>submit</w:t>
-      </w:r>
-      <w:r>
-        <w:t xml:space="preserve"> a paper</w:t>
-      </w:r>
-      <w:r>
-        <w:t xml:space="preserve"> entitled: “</w:t>
+        <w:t>We would like to submit a paper entitled: “</w:t>
       </w:r>
       <w:r>
         <w:rPr>
@@ -29,7 +20,7 @@
         <w:t>Connecting our models for calculated biological responses to extreme heat</w:t>
       </w:r>
       <w:r>
-        <w:t xml:space="preserve">” for consideration as a Review/Opinion article in </w:t>
+        <w:t xml:space="preserve">” for consideration as an Opinion article in </w:t>
       </w:r>
       <w:r>
         <w:rPr>
@@ -39,10 +30,14 @@
         <w:t>Trends in Ecology and Evolution</w:t>
       </w:r>
       <w:r>
-        <w:t xml:space="preserve">. </w:t>
-      </w:r>
-    </w:p>
-    <w:p/>
+        <w:t>.  </w:t>
+      </w:r>
+    </w:p>
+    <w:p>
+      <w:r>
+        <w:t> </w:t>
+      </w:r>
+    </w:p>
     <w:p>
       <w:r>
         <w:t xml:space="preserve">While conceptual frameworks around how extreme heat will impact biological systems exist (e.g., </w:t>
@@ -53,22 +48,7 @@
       </w:r>
       <w:proofErr w:type="spellEnd"/>
       <w:r>
-        <w:t xml:space="preserve"> León</w:t>
-      </w:r>
-      <w:r>
-        <w:t xml:space="preserve"> et al. 2024), there is a disturbing lack of quantitative modelling approaches that can capture the multifaceted ways in which </w:t>
-      </w:r>
-      <w:r>
-        <w:t>it</w:t>
-      </w:r>
-      <w:r>
-        <w:t xml:space="preserve"> will shape and re-shape biodiversity, community composition and ecosystem services. </w:t>
-      </w:r>
-      <w:r>
-        <w:t>Indeed, o</w:t>
-      </w:r>
-      <w:r>
-        <w:t xml:space="preserve">ne of the outstanding questions proposed by </w:t>
+        <w:t xml:space="preserve"> León et al. 2024), the problem remains that we lack quantitative modelling approaches that can capture the multifaceted ways in which it will shape and re-shape biodiversity, community composition and ecosystem services. Indeed, one of the outstanding questions proposed by </w:t>
       </w:r>
       <w:proofErr w:type="spellStart"/>
       <w:r>
@@ -76,10 +56,7 @@
       </w:r>
       <w:proofErr w:type="spellEnd"/>
       <w:r>
-        <w:t xml:space="preserve"> León</w:t>
-      </w:r>
-      <w:r>
-        <w:t xml:space="preserve"> et al. 2024 was “</w:t>
+        <w:t xml:space="preserve"> León et al. 2024 was “</w:t>
       </w:r>
       <w:r>
         <w:rPr>
@@ -89,291 +66,153 @@
         <w:t>How can variation in ecological responses to heat extremes be predicted?</w:t>
       </w:r>
       <w:r>
-        <w:t xml:space="preserve">”. </w:t>
-      </w:r>
-    </w:p>
-    <w:p/>
-    <w:p>
-      <w:r>
-        <w:t xml:space="preserve">We have brought together a uniquely multidisciplinary team of leading plant and animal biologists and socioecological scientists with expertise in various fields (physiology, ecology, evolution and socioecological systems) </w:t>
-      </w:r>
-      <w:r>
-        <w:t xml:space="preserve">to address this question. </w:t>
-      </w:r>
-      <w:r>
-        <w:t xml:space="preserve">The diverse perspectives of our team have been crucial given that modelling across disciplines has largely developed independently and ignore the important ways in which they can be integrated. We believe that there are now exciting, un-tapped opportunities to integrate modelling frameworks to squarely address </w:t>
-      </w:r>
-      <w:r>
-        <w:t xml:space="preserve">the question </w:t>
-      </w:r>
-      <w:r>
-        <w:t>o</w:t>
-      </w:r>
-      <w:r>
-        <w:t xml:space="preserve">f how ecological responses to extreme heat can be </w:t>
-      </w:r>
-      <w:r>
-        <w:t>predicted</w:t>
-      </w:r>
-      <w:r>
-        <w:t xml:space="preserve">. </w:t>
-      </w:r>
-      <w:r>
-        <w:t>Integration of different models will provide new opportunities to make more precise predictions about how the effect of extreme heat will differentially impact species within communities, the strength with which these species interact and how changes in such interactions cascade to affect the resilience of human and natural systems now and into the future.</w:t>
-      </w:r>
-    </w:p>
-    <w:p/>
-    <w:p>
-      <w:r>
-        <w:t xml:space="preserve">Our Review/Opinion will </w:t>
-      </w:r>
-      <w:r>
-        <w:t>discuss our vision for</w:t>
-      </w:r>
-      <w:r>
-        <w:t xml:space="preserve"> a</w:t>
-      </w:r>
-      <w:r>
-        <w:t>n integrated</w:t>
-      </w:r>
-      <w:r>
-        <w:t xml:space="preserve"> quantitative modelling framework </w:t>
-      </w:r>
-      <w:r>
-        <w:t>to calculate the effects of extreme heat</w:t>
-      </w:r>
-      <w:r>
+        <w:t>”.  </w:t>
+      </w:r>
+    </w:p>
+    <w:p>
+      <w:r>
+        <w:t> </w:t>
+      </w:r>
+    </w:p>
+    <w:p>
+      <w:r>
+        <w:t>We have brought together a uniquely multidisciplinary team of leading plant and animal biologists and socioecological scientists with expertise in various fields (physiology, ecology, evolution and socioecological systems) to address this question. Our ideas emerged from two in person workshops held in 2024. The diverse perspectives of our team have been crucial given that modelling across disciplines has largely developed independently and ignores the important ways in which they can be integrated. We believe that there are now exciting, un-tapped opportunities to integrate modelling frameworks to directly address the question of how ecological responses to extreme heat can be predicted. Integration of different models will provide new opportunities to make more precise predictions about how extreme heat will differentially impact species within communities, the strength with which these species interact and how changes in such interactions cascade to affect the resilience of human and natural systems now and into the future. </w:t>
+      </w:r>
+    </w:p>
+    <w:p>
+      <w:r>
+        <w:t> </w:t>
+      </w:r>
+    </w:p>
+    <w:p>
+      <w:r>
+        <w:t>Our Opinion piece will discuss our vision for an integrated quantitative modelling framework to calculate the effects of extreme heat on diverse organisms (plants and animals). For example, quantitative predictions that use coupled mechanistic models (biophysical models of heat and mass exchange, Dynamic Energy Budget Theory –</w:t>
+      </w:r>
+      <w:r>
+        <w:rPr>
+          <w:rFonts w:ascii="Arial" w:hAnsi="Arial" w:cs="Arial"/>
+        </w:rPr>
+        <w:t> </w:t>
+      </w:r>
+      <w:proofErr w:type="spellStart"/>
+      <w:r>
+        <w:rPr>
+          <w:lang w:val="en-US"/>
+        </w:rPr>
+        <w:t>Kooijman</w:t>
+      </w:r>
+      <w:proofErr w:type="spellEnd"/>
+      <w:r>
+        <w:rPr>
+          <w:lang w:val="en-US"/>
+        </w:rPr>
+        <w:t xml:space="preserve"> 2010, Briscoe </w:t>
+      </w:r>
+      <w:r>
+        <w:rPr>
+          <w:i/>
+          <w:iCs/>
+          <w:lang w:val="en-US"/>
+        </w:rPr>
+        <w:t>et al.</w:t>
+      </w:r>
+      <w:r>
+        <w:rPr>
+          <w:lang w:val="en-US"/>
+        </w:rPr>
+        <w:t xml:space="preserve"> 2023, Kearney &amp; Leigh 2024</w:t>
+      </w:r>
+      <w:r>
+        <w:t>) can be combined with physiological (e.g., thermal death time models –</w:t>
+      </w:r>
+      <w:r>
+        <w:rPr>
+          <w:rFonts w:ascii="Arial" w:hAnsi="Arial" w:cs="Arial"/>
+        </w:rPr>
+        <w:t> </w:t>
+      </w:r>
+      <w:r>
+        <w:t xml:space="preserve">e.g., Rezende </w:t>
+      </w:r>
+      <w:r>
+        <w:rPr>
+          <w:i/>
+          <w:iCs/>
+        </w:rPr>
+        <w:t>et al.</w:t>
+      </w:r>
+      <w:r>
+        <w:t xml:space="preserve"> 2020, </w:t>
+      </w:r>
+      <w:proofErr w:type="spellStart"/>
+      <w:r>
+        <w:rPr>
+          <w:lang w:val="en-US"/>
+        </w:rPr>
+        <w:t>Ørsted</w:t>
+      </w:r>
+      <w:proofErr w:type="spellEnd"/>
+      <w:r>
+        <w:rPr>
+          <w:lang w:val="en-US"/>
+        </w:rPr>
         <w:t xml:space="preserve"> </w:t>
       </w:r>
       <w:r>
-        <w:t>on</w:t>
-      </w:r>
-      <w:r>
-        <w:t xml:space="preserve"> diverse organisms (plants and animals). For example, quantitative predictions that use coupled mechanistic models (Biophysical models of heat and mass exchange, Dynamic Energy Budget Theory – </w:t>
-      </w:r>
-      <w:proofErr w:type="spellStart"/>
-      <w:r>
-        <w:rPr>
-          <w:lang w:val="en-US"/>
-        </w:rPr>
-        <w:t>Kooijman</w:t>
-      </w:r>
-      <w:proofErr w:type="spellEnd"/>
-      <w:r>
-        <w:rPr>
-          <w:lang w:val="en-US"/>
-        </w:rPr>
-        <w:t xml:space="preserve"> 2010, </w:t>
-      </w:r>
-      <w:r>
-        <w:rPr>
-          <w:lang w:val="en-US"/>
-        </w:rPr>
-        <w:t>Briscoe</w:t>
-      </w:r>
-      <w:r>
-        <w:rPr>
-          <w:lang w:val="en-US"/>
+        <w:rPr>
+          <w:i/>
+          <w:iCs/>
+          <w:lang w:val="en-US"/>
+        </w:rPr>
+        <w:t>et al.</w:t>
+      </w:r>
+      <w:r>
+        <w:rPr>
+          <w:lang w:val="en-US"/>
+        </w:rPr>
+        <w:t xml:space="preserve"> 2024</w:t>
+      </w:r>
+      <w:r>
+        <w:t>) and population/community ecology models to predict the spread of pests and disease and changes in primary productivity in ways that affect natural and agricultural systems. Such a modelling framework can be used for developing interventions that maintain resilience of biological and agricultural systems in the face of extreme heat. Importantly, we will identify ways to incorporate major biological responses and environmental mediators into our proposed modelling framework (e.g., how thermal sensitivity can be mediated by microbes, water availability and plasticity), providing clear connections between conceptual frameworks and the models that make quantitative predictions of the responses to extreme heat. </w:t>
+      </w:r>
+    </w:p>
+    <w:p>
+      <w:r>
+        <w:t> </w:t>
+      </w:r>
+    </w:p>
+    <w:p>
+      <w:r>
+        <w:t>We outline our intended plan in more detail below along with the authorship list. While our author list is larger than typical for TREE, we believe we have brought together a complementary</w:t>
+      </w:r>
+      <w:r>
+        <w:rPr>
+          <w:u w:val="single"/>
         </w:rPr>
         <w:t xml:space="preserve"> </w:t>
       </w:r>
       <w:r>
-        <w:rPr>
-          <w:i/>
-          <w:iCs/>
-          <w:lang w:val="en-US"/>
-        </w:rPr>
-        <w:t>et al.</w:t>
-      </w:r>
-      <w:r>
-        <w:rPr>
-          <w:lang w:val="en-US"/>
-        </w:rPr>
-        <w:t xml:space="preserve"> 2023, </w:t>
-      </w:r>
-      <w:r>
-        <w:rPr>
-          <w:lang w:val="en-US"/>
-        </w:rPr>
-        <w:t>Kearney</w:t>
-      </w:r>
-      <w:r>
-        <w:rPr>
-          <w:lang w:val="en-US"/>
-        </w:rPr>
-        <w:t xml:space="preserve"> &amp;</w:t>
-      </w:r>
-      <w:r>
-        <w:rPr>
-          <w:lang w:val="en-US"/>
-        </w:rPr>
-        <w:t xml:space="preserve"> Leigh</w:t>
-      </w:r>
-      <w:r>
-        <w:rPr>
-          <w:lang w:val="en-US"/>
-        </w:rPr>
-        <w:t xml:space="preserve"> 2024</w:t>
-      </w:r>
-      <w:r>
-        <w:t xml:space="preserve">) </w:t>
-      </w:r>
-      <w:r>
-        <w:t xml:space="preserve">can be </w:t>
-      </w:r>
-      <w:r>
-        <w:t xml:space="preserve">combined with physiological (e.g., thermal death time models – e.g., Rezende </w:t>
-      </w:r>
-      <w:r>
-        <w:rPr>
-          <w:i/>
-          <w:iCs/>
-        </w:rPr>
-        <w:t>et al.</w:t>
-      </w:r>
-      <w:r>
-        <w:t xml:space="preserve"> 2020, </w:t>
-      </w:r>
-      <w:proofErr w:type="spellStart"/>
-      <w:r>
-        <w:rPr>
-          <w:lang w:val="en-US"/>
-        </w:rPr>
-        <w:t>Ørsted</w:t>
-      </w:r>
-      <w:proofErr w:type="spellEnd"/>
-      <w:r>
-        <w:rPr>
-          <w:lang w:val="en-US"/>
-        </w:rPr>
-        <w:t xml:space="preserve"> </w:t>
-      </w:r>
-      <w:r>
-        <w:rPr>
-          <w:i/>
-          <w:iCs/>
-          <w:lang w:val="en-US"/>
-        </w:rPr>
-        <w:t>et al.</w:t>
-      </w:r>
-      <w:r>
-        <w:rPr>
-          <w:lang w:val="en-US"/>
-        </w:rPr>
-        <w:t xml:space="preserve"> 2024</w:t>
-      </w:r>
-      <w:r>
-        <w:t xml:space="preserve">) and population/community ecology models </w:t>
-      </w:r>
-      <w:r>
-        <w:t>to</w:t>
-      </w:r>
-      <w:r>
-        <w:t xml:space="preserve"> predict the spread of pests and disease and changes in primary productivity in ways that affect natural and agricultural systems. Such a modelling framework </w:t>
-      </w:r>
-      <w:r>
-        <w:t>can</w:t>
-      </w:r>
-      <w:r>
-        <w:t xml:space="preserve"> also </w:t>
-      </w:r>
-      <w:r>
-        <w:t>be used</w:t>
-      </w:r>
-      <w:r>
-        <w:t xml:space="preserve"> for </w:t>
-      </w:r>
-      <w:r>
-        <w:t xml:space="preserve">developing interventions that </w:t>
-      </w:r>
-      <w:r>
-        <w:t>maintain resilience</w:t>
-      </w:r>
-      <w:r>
-        <w:t xml:space="preserve"> </w:t>
-      </w:r>
-      <w:r>
-        <w:t xml:space="preserve">of </w:t>
-      </w:r>
-      <w:r>
-        <w:t xml:space="preserve">biological and agricultural systems in the face of </w:t>
-      </w:r>
-      <w:r>
-        <w:t xml:space="preserve">extreme heat. </w:t>
-      </w:r>
-      <w:r>
-        <w:t>Importantly, w</w:t>
-      </w:r>
-      <w:r>
-        <w:t xml:space="preserve">e will </w:t>
-      </w:r>
-      <w:r>
-        <w:t>also identify</w:t>
-      </w:r>
-      <w:r>
-        <w:t xml:space="preserve"> </w:t>
-      </w:r>
-      <w:r>
-        <w:t xml:space="preserve">ways to incorporate </w:t>
-      </w:r>
-      <w:r>
-        <w:t>key</w:t>
-      </w:r>
-      <w:r>
-        <w:t xml:space="preserve"> biological responses and environmental mediators into our proposed modelling framework (e.g., how thermal sensitivity can be mediated by microbes, water availability and plasticity), providing clear connections between conceptual frameworks and the models that make calculated predictions</w:t>
-      </w:r>
-      <w:r>
-        <w:t xml:space="preserve"> in response to extreme heat</w:t>
-      </w:r>
-      <w:r>
-        <w:t>.</w:t>
-      </w:r>
-    </w:p>
-    <w:p/>
-    <w:p>
-      <w:r>
-        <w:t>W</w:t>
-      </w:r>
-      <w:r>
-        <w:t xml:space="preserve">e outline our intended plan in more detail below along with the authorship list. </w:t>
-      </w:r>
-      <w:r>
-        <w:t xml:space="preserve">While our author list is larger than typical for TREE, we believe we have brought together a stellar cast of </w:t>
-      </w:r>
-      <w:r>
-        <w:t xml:space="preserve">leading researchers </w:t>
-      </w:r>
-      <w:r>
-        <w:t xml:space="preserve">across these fields </w:t>
-      </w:r>
-      <w:r>
-        <w:t xml:space="preserve">with expertise in modelling </w:t>
-      </w:r>
-      <w:r>
-        <w:t>that is needed for such a synthesis</w:t>
-      </w:r>
-      <w:r>
-        <w:t xml:space="preserve">. </w:t>
-      </w:r>
-      <w:r>
-        <w:t>We hope that you find our proposal as exciting as we do</w:t>
-      </w:r>
-      <w:r>
-        <w:t xml:space="preserve"> and look forward to hearing your response</w:t>
-      </w:r>
-      <w:r>
-        <w:t xml:space="preserve">. </w:t>
-      </w:r>
-    </w:p>
-    <w:p/>
-    <w:p>
-      <w:r>
-        <w:t xml:space="preserve">Sincerely, </w:t>
-      </w:r>
-    </w:p>
-    <w:p>
-      <w:r>
-        <w:t>Daniel Noble (on behalf of all co-authors)</w:t>
+        <w:t>cast of leading researchers across these fields with expertise in modelling that is needed for such a synthesis. We hope that you find our proposal as exciting as we do and look forward to hearing your response.  </w:t>
+      </w:r>
+    </w:p>
+    <w:p>
+      <w:r>
+        <w:t> </w:t>
+      </w:r>
+    </w:p>
+    <w:p>
+      <w:r>
+        <w:t>Sincerely,  </w:t>
+      </w:r>
+    </w:p>
+    <w:p>
+      <w:r>
+        <w:t>Daniel Noble (on behalf of all co-authors) </w:t>
+      </w:r>
+    </w:p>
+    <w:p>
+      <w:r>
+        <w:t> </w:t>
       </w:r>
     </w:p>
     <w:p/>
@@ -394,33 +233,92 @@
       </w:pPr>
     </w:p>
     <w:p>
-      <w:pPr>
+      <w:r>
         <w:rPr>
           <w:b/>
           <w:bCs/>
         </w:rPr>
-      </w:pPr>
-    </w:p>
-    <w:p>
-      <w:pPr>
+        <w:lastRenderedPageBreak/>
+        <w:t>Proposal</w:t>
+      </w:r>
+      <w:r>
+        <w:t>:</w:t>
+      </w:r>
+    </w:p>
+    <w:p>
+      <w:r>
         <w:rPr>
           <w:b/>
           <w:bCs/>
         </w:rPr>
-      </w:pPr>
-    </w:p>
-    <w:p>
-      <w:r>
+        <w:t>Authors</w:t>
+      </w:r>
+      <w:r>
+        <w:t>:</w:t>
+      </w:r>
+    </w:p>
+    <w:p>
+      <w:r>
+        <w:t xml:space="preserve">Daniel W.A. Noble, Micheal R. Kearney, Belinda </w:t>
+      </w:r>
+      <w:proofErr w:type="spellStart"/>
+      <w:r>
+        <w:t>Medlyn</w:t>
+      </w:r>
+      <w:proofErr w:type="spellEnd"/>
+      <w:r>
+        <w:t xml:space="preserve">, </w:t>
+      </w:r>
+      <w:r>
+        <w:t>Marg</w:t>
+      </w:r>
+      <w:r>
+        <w:t>a</w:t>
+      </w:r>
+      <w:r>
+        <w:t>ret Mayfield</w:t>
+      </w:r>
+      <w:r>
+        <w:t xml:space="preserve">, Ary Hoffmann, James Cook, Brajesh Singh, Adrienne Nicotra, Brendan </w:t>
+      </w:r>
+      <w:proofErr w:type="spellStart"/>
+      <w:r>
+        <w:t>Choat</w:t>
+      </w:r>
+      <w:proofErr w:type="spellEnd"/>
+      <w:r>
+        <w:t xml:space="preserve">, </w:t>
+      </w:r>
+      <w:r>
+        <w:t xml:space="preserve">Owen Atkin, </w:t>
+      </w:r>
+      <w:r>
+        <w:t xml:space="preserve">Barry </w:t>
+      </w:r>
+      <w:proofErr w:type="spellStart"/>
+      <w:r>
+        <w:t>Pogson</w:t>
+      </w:r>
+      <w:proofErr w:type="spellEnd"/>
+      <w:r>
+        <w:t xml:space="preserve">, Danielle Way, Alison Bentley, Ian Wright, </w:t>
+      </w:r>
+      <w:proofErr w:type="spellStart"/>
+      <w:r>
+        <w:t>Xuemei</w:t>
+      </w:r>
+      <w:proofErr w:type="spellEnd"/>
+      <w:r>
+        <w:t xml:space="preserve"> Bai, Kate Henne, Philippa Collin, Zhonghua Chen, Joan Leach, Steven Lade</w:t>
+      </w:r>
+    </w:p>
+    <w:p>
+      <w:pPr>
         <w:rPr>
           <w:b/>
           <w:bCs/>
         </w:rPr>
-        <w:lastRenderedPageBreak/>
-        <w:t>Proposal</w:t>
-      </w:r>
-      <w:r>
-        <w:t>:</w:t>
-      </w:r>
+      </w:pPr>
     </w:p>
     <w:p>
       <w:r>
@@ -428,7 +326,7 @@
           <w:b/>
           <w:bCs/>
         </w:rPr>
-        <w:t>Authors</w:t>
+        <w:t>Affiliations</w:t>
       </w:r>
       <w:r>
         <w:t>:</w:t>
@@ -436,59 +334,39 @@
     </w:p>
     <w:p>
       <w:r>
-        <w:t xml:space="preserve">Daniel W.A. Noble, Micheal R. Kearney, Belinda </w:t>
-      </w:r>
-      <w:proofErr w:type="spellStart"/>
-      <w:r>
-        <w:t>Medlyn</w:t>
-      </w:r>
-      <w:proofErr w:type="spellEnd"/>
-      <w:r>
-        <w:t xml:space="preserve">, </w:t>
-      </w:r>
-      <w:r>
-        <w:t>Marg</w:t>
-      </w:r>
-      <w:r>
-        <w:t>a</w:t>
-      </w:r>
-      <w:r>
-        <w:t>ret Mayfield</w:t>
-      </w:r>
-      <w:r>
-        <w:t xml:space="preserve">, Ary Hoffmann, James Cook, Brajesh Singh, Adrienne Nicotra, Brendan </w:t>
-      </w:r>
-      <w:proofErr w:type="spellStart"/>
-      <w:r>
-        <w:t>Choat</w:t>
-      </w:r>
-      <w:proofErr w:type="spellEnd"/>
-      <w:r>
-        <w:t xml:space="preserve">, </w:t>
-      </w:r>
-      <w:r>
-        <w:t xml:space="preserve">Owen Atkin, </w:t>
-      </w:r>
-      <w:r>
-        <w:t xml:space="preserve">Barry </w:t>
-      </w:r>
-      <w:proofErr w:type="spellStart"/>
-      <w:r>
-        <w:t>Pogson</w:t>
-      </w:r>
-      <w:proofErr w:type="spellEnd"/>
-      <w:r>
-        <w:t xml:space="preserve">, Danielle Way, Alison Bentley, Ian Wright, </w:t>
-      </w:r>
-      <w:proofErr w:type="spellStart"/>
-      <w:r>
-        <w:t>Xuemei</w:t>
-      </w:r>
-      <w:proofErr w:type="spellEnd"/>
-      <w:r>
-        <w:t xml:space="preserve"> Bai, Kate Henne, Philippa Collin, Zhonghua Chen, Joan Leach, Steven Lade</w:t>
-      </w:r>
-    </w:p>
+        <w:rPr>
+          <w:vertAlign w:val="superscript"/>
+        </w:rPr>
+        <w:t>1</w:t>
+      </w:r>
+      <w:r>
+        <w:t>Division of Ecology and Evolution, Research School of Biology, The Australian National University, Canberra ACT 2602</w:t>
+      </w:r>
+    </w:p>
+    <w:p>
+      <w:r>
+        <w:t xml:space="preserve">Department of Biosciences, The University of Melbourne. </w:t>
+      </w:r>
+    </w:p>
+    <w:p>
+      <w:r>
+        <w:t>Division of Plant Sciences, Research School of Biology, The Australian National University, Canberra ACT 2602</w:t>
+      </w:r>
+    </w:p>
+    <w:p>
+      <w:r>
+        <w:t xml:space="preserve">Fenner School of Environment and Society, </w:t>
+      </w:r>
+      <w:r>
+        <w:t>The Australian National University, Canberra ACT 2602</w:t>
+      </w:r>
+    </w:p>
+    <w:p>
+      <w:r>
+        <w:t>Hawksbury Institute for the Environment, Western Sydney University</w:t>
+      </w:r>
+    </w:p>
+    <w:p/>
     <w:p>
       <w:pPr>
         <w:rPr>
@@ -496,54 +374,14 @@
           <w:bCs/>
         </w:rPr>
       </w:pPr>
-    </w:p>
-    <w:p>
       <w:r>
         <w:rPr>
           <w:b/>
           <w:bCs/>
         </w:rPr>
-        <w:t>Affiliations</w:t>
-      </w:r>
-      <w:r>
-        <w:t>:</w:t>
-      </w:r>
-    </w:p>
-    <w:p>
-      <w:r>
-        <w:rPr>
-          <w:vertAlign w:val="superscript"/>
-        </w:rPr>
-        <w:t>1</w:t>
-      </w:r>
-      <w:r>
-        <w:t>Division of Ecology and Evolution, Research School of Biology, The Australian National University, Canberra ACT 2602</w:t>
-      </w:r>
-    </w:p>
-    <w:p>
-      <w:r>
-        <w:t xml:space="preserve">Department of Biosciences, The University of Melbourne. </w:t>
-      </w:r>
-    </w:p>
-    <w:p>
-      <w:r>
-        <w:t>Division of Plant Sciences, Research School of Biology, The Australian National University, Canberra ACT 2602</w:t>
-      </w:r>
-    </w:p>
-    <w:p>
-      <w:r>
-        <w:t xml:space="preserve">Fenner School of Environment and Society, </w:t>
-      </w:r>
-      <w:r>
-        <w:t>The Australian National University, Canberra ACT 2602</w:t>
-      </w:r>
-    </w:p>
-    <w:p>
-      <w:r>
-        <w:t>Hawksbury Institute for the Environment, Western Sydney University</w:t>
-      </w:r>
-    </w:p>
-    <w:p/>
+        <w:t>Abstract</w:t>
+      </w:r>
+    </w:p>
     <w:p>
       <w:pPr>
         <w:rPr>
@@ -553,48 +391,41 @@
       </w:pPr>
       <w:r>
         <w:rPr>
-          <w:b/>
-          <w:bCs/>
-        </w:rPr>
-        <w:t>Abstract</w:t>
-      </w:r>
-    </w:p>
-    <w:p>
-      <w:pPr>
-        <w:rPr>
-          <w:b/>
-          <w:bCs/>
-        </w:rPr>
-      </w:pPr>
-      <w:r>
-        <w:rPr>
-          <w:lang w:val="en-US"/>
-        </w:rPr>
-        <w:t>Anthropogenic climate change is leading to more frequent and extreme heat waves. These short-term but large-scale atmospheric events are radically re-shaping interactions among organisms, impacting biodiversity, community composition and ecosystem services crucial to natural systems and food security. Predicting heat wave impacts on interacting species requires an understanding of the processes driving differential exposure and sensitivity of organisms to extreme heat events in a life-cycle context. But this requires a modelling framework that can capture species-specific responses via habitat-mediated microclimates, biophysics of body temperature, physiological sensitivity, and its effects on vital rates across ontogeny and thermal history. We show how existing models in disparate fields can be linked to achieve this level of understanding to allow calculated responses to extreme heat</w:t>
-      </w:r>
-      <w:r>
-        <w:rPr>
-          <w:lang w:val="en-US"/>
-        </w:rPr>
-        <w:t xml:space="preserve"> now and into the future</w:t>
-      </w:r>
-      <w:r>
-        <w:rPr>
-          <w:lang w:val="en-US"/>
-        </w:rPr>
-        <w:t>.</w:t>
-      </w:r>
-      <w:r>
-        <w:t> </w:t>
-      </w:r>
-    </w:p>
-    <w:p>
-      <w:pPr>
-        <w:rPr>
-          <w:b/>
-          <w:bCs/>
-        </w:rPr>
-      </w:pPr>
+          <w:lang w:val="en-US"/>
+        </w:rPr>
+        <w:t xml:space="preserve">Anthropogenic climate change is leading to more frequent and extreme heat waves. These short-term but large-scale events are radically re-shaping interactions among organisms, impacting biodiversity, community composition and ecosystem services crucial to natural systems and food security. Predicting heat wave impacts on interacting species requires an understanding of the processes driving differential exposure and sensitivity of organisms to extreme heat events in a life-cycle context. But this, in turn, requires a modelling framework that can capture species-specific responses via habitat-mediated microclimates, biophysics of body temperature, physiological sensitivity, and its effects on vital rates across ontogeny and thermal history. We show how existing models in disparate fields can be linked to achieve this level of understanding to allow </w:t>
+      </w:r>
+      <w:r>
+        <w:rPr>
+          <w:lang w:val="en-US"/>
+        </w:rPr>
+        <w:t xml:space="preserve">for </w:t>
+      </w:r>
+      <w:r>
+        <w:rPr>
+          <w:lang w:val="en-US"/>
+        </w:rPr>
+        <w:t>calculated</w:t>
+      </w:r>
+      <w:r>
+        <w:rPr>
+          <w:u w:val="single"/>
+          <w:lang w:val="en-US"/>
+        </w:rPr>
+        <w:t xml:space="preserve"> </w:t>
+      </w:r>
+      <w:r>
+        <w:rPr>
+          <w:lang w:val="en-US"/>
+        </w:rPr>
+        <w:t>responses to extreme heat now and into the future.</w:t>
+      </w:r>
+      <w:r>
+        <w:rPr>
+          <w:rFonts w:ascii="Arial" w:hAnsi="Arial" w:cs="Arial"/>
+        </w:rPr>
+        <w:t> </w:t>
+      </w:r>
     </w:p>
     <w:p>
       <w:pPr>
@@ -610,7 +441,7 @@
           <w:noProof/>
         </w:rPr>
         <w:drawing>
-          <wp:inline distT="0" distB="0" distL="0" distR="0" wp14:anchorId="67F11397" wp14:editId="6F3AAC38">
+          <wp:inline distT="0" distB="0" distL="0" distR="0" wp14:anchorId="67F11397" wp14:editId="338BA9C8">
             <wp:extent cx="6254885" cy="4378666"/>
             <wp:effectExtent l="0" t="0" r="0" b="3175"/>
             <wp:docPr id="212276124" name="Picture 1"/>
@@ -814,10 +645,7 @@
         <w:t>exposure</w:t>
       </w:r>
       <w:r>
-        <w:t xml:space="preserve"> to extreme heat and dynamic energy budget theory</w:t>
-      </w:r>
-      <w:r>
-        <w:t xml:space="preserve"> </w:t>
+        <w:t xml:space="preserve"> to extreme heat and dynamic energy budget theory </w:t>
       </w:r>
     </w:p>
     <w:p>

</xml_diff>

<commit_message>
Version 2 of proposal
</commit_message>
<xml_diff>
--- a/ms/proposal.docx
+++ b/ms/proposal.docx
@@ -30,7 +30,7 @@
         <w:t>Trends in Ecology and Evolution</w:t>
       </w:r>
       <w:r>
-        <w:t>.  </w:t>
+        <w:t>.</w:t>
       </w:r>
     </w:p>
     <w:p/>
@@ -38,188 +38,68 @@
       <w:r>
         <w:t xml:space="preserve">Heatwaves </w:t>
       </w:r>
-      <w:proofErr w:type="gramStart"/>
-      <w:r>
-        <w:t>. . . .</w:t>
-      </w:r>
-      <w:proofErr w:type="gramEnd"/>
+      <w:r>
+        <w:t xml:space="preserve">are rapidly increasing in intensity and frequency globally. Extreme heatwaves </w:t>
+      </w:r>
+      <w:r>
+        <w:t xml:space="preserve">will </w:t>
+      </w:r>
+      <w:r>
+        <w:t>impact</w:t>
+      </w:r>
       <w:r>
         <w:t xml:space="preserve"> </w:t>
       </w:r>
-      <w:proofErr w:type="gramStart"/>
-      <w:r>
-        <w:t>( pull</w:t>
-      </w:r>
-      <w:proofErr w:type="gramEnd"/>
-      <w:r>
-        <w:t xml:space="preserve"> from EOI) - establish the importance of heatwaves first and then why our current modelling frameworks are not up to the challenge of either predicting impacts or informing solutions . . . </w:t>
-      </w:r>
-    </w:p>
-    <w:p>
-      <w:r>
-        <w:t> </w:t>
-      </w:r>
-    </w:p>
-    <w:p>
-      <w:r>
-        <w:t>We have brought together a uniquely multidisciplinary team of leading plant and animal biologists and socioecological scientists with expertise in various fields (physiology, ecology, evolution and socioecological systems) to address this question. Our ideas emerged from two in person workshops held in 2024. The diverse perspectives of our team have been crucial given that modelling across disciplines has largely developed independently and ignores the important ways in which they can be integrated. We believe that there are now exciting, un-tapped opportunities to integrate modelling frameworks to directly address the question of how ecological responses to extreme heat can be predicted. Integration of different models will provide new opportunities to make more precise predictions about how extreme heat will differentially impact species within communities, the strength with which these species interact and how changes in such interactions cascade to affect the resilience of human and natural systems now and into the future. </w:t>
-      </w:r>
-    </w:p>
-    <w:p>
-      <w:r>
-        <w:t> </w:t>
-      </w:r>
-    </w:p>
-    <w:p>
-      <w:r>
-        <w:t>Our Opinion piece will discuss our vision for an integrated quantitative modelling framework to calculate the effects of extreme heat on diverse organisms (plants and animals). For example, quantitative predictions that use coupled mechanistic models (biophysical models of heat and mass exchange, Dynamic Energy Budget Theory –</w:t>
-      </w:r>
-      <w:r>
-        <w:rPr>
-          <w:rFonts w:ascii="Arial" w:hAnsi="Arial" w:cs="Arial"/>
-        </w:rPr>
-        <w:t> </w:t>
-      </w:r>
-      <w:proofErr w:type="spellStart"/>
-      <w:r>
-        <w:rPr>
-          <w:lang w:val="en-US"/>
-        </w:rPr>
-        <w:t>Kooijman</w:t>
-      </w:r>
-      <w:proofErr w:type="spellEnd"/>
-      <w:r>
-        <w:rPr>
-          <w:lang w:val="en-US"/>
-        </w:rPr>
-        <w:t xml:space="preserve"> 2010, Briscoe </w:t>
-      </w:r>
-      <w:r>
-        <w:rPr>
-          <w:i/>
-          <w:iCs/>
-          <w:lang w:val="en-US"/>
-        </w:rPr>
-        <w:t>et al.</w:t>
-      </w:r>
-      <w:r>
-        <w:rPr>
-          <w:lang w:val="en-US"/>
-        </w:rPr>
-        <w:t xml:space="preserve"> 2023, Kearney &amp; Leigh 2024</w:t>
-      </w:r>
-      <w:r>
-        <w:t>) can be combined with physiological (e.g., thermal death time models –</w:t>
-      </w:r>
-      <w:r>
-        <w:rPr>
-          <w:rFonts w:ascii="Arial" w:hAnsi="Arial" w:cs="Arial"/>
-        </w:rPr>
-        <w:t> </w:t>
-      </w:r>
-      <w:r>
-        <w:t xml:space="preserve">e.g., Rezende </w:t>
-      </w:r>
-      <w:r>
-        <w:rPr>
-          <w:i/>
-          <w:iCs/>
-        </w:rPr>
-        <w:t>et al.</w:t>
-      </w:r>
-      <w:r>
-        <w:t xml:space="preserve"> 2020, </w:t>
-      </w:r>
-      <w:proofErr w:type="spellStart"/>
-      <w:r>
-        <w:rPr>
-          <w:lang w:val="en-US"/>
-        </w:rPr>
-        <w:t>Ørsted</w:t>
-      </w:r>
-      <w:proofErr w:type="spellEnd"/>
-      <w:r>
-        <w:rPr>
-          <w:lang w:val="en-US"/>
-        </w:rPr>
+      <w:r>
+        <w:t>diverse taxa within communities with</w:t>
+      </w:r>
+      <w:r>
+        <w:t xml:space="preserve"> large-scale </w:t>
+      </w:r>
+      <w:r>
+        <w:t>effects on</w:t>
+      </w:r>
+      <w:r>
+        <w:t xml:space="preserve"> community assembl</w:t>
+      </w:r>
+      <w:r>
+        <w:t>y</w:t>
+      </w:r>
+      <w:r>
+        <w:t xml:space="preserve"> and ecosystem productivity [</w:t>
+      </w:r>
+      <w:r>
+        <w:t>1–3</w:t>
+      </w:r>
+      <w:r>
+        <w:t xml:space="preserve">]. </w:t>
+      </w:r>
+      <w:r>
+        <w:t xml:space="preserve">While we are beginning to understand how heat waves </w:t>
+      </w:r>
+      <w:r>
+        <w:t xml:space="preserve">can </w:t>
+      </w:r>
+      <w:r>
+        <w:t>cascade through ecosystems</w:t>
+      </w:r>
+      <w:r>
+        <w:t xml:space="preserve">, </w:t>
+      </w:r>
+      <w:r>
+        <w:t>a</w:t>
+      </w:r>
+      <w:r>
         <w:t xml:space="preserve"> </w:t>
       </w:r>
       <w:r>
-        <w:rPr>
-          <w:i/>
-          <w:iCs/>
-          <w:lang w:val="en-US"/>
-        </w:rPr>
-        <w:t>et al.</w:t>
-      </w:r>
-      <w:r>
-        <w:rPr>
-          <w:lang w:val="en-US"/>
-        </w:rPr>
-        <w:t xml:space="preserve"> 2024</w:t>
-      </w:r>
-      <w:r>
-        <w:t>) and population/community ecology models to predict the spread of pests and disease and changes in primary productivity in ways that affect natural and agricultural systems. Such a modelling framework can be used for developing interventions that maintain resilience of biological and agricultural systems in the face of extreme heat. Importantly, we will identify ways to incorporate major biological responses and environmental mediators into our proposed modelling framework (e.g., how thermal sensitivity can be mediated by microbes, water availability and plasticity), providing clear connections between conceptual frameworks and the models that make quantitative predictions of the responses to extreme heat. </w:t>
-      </w:r>
-    </w:p>
-    <w:p>
-      <w:r>
-        <w:t> </w:t>
-      </w:r>
-    </w:p>
-    <w:p>
-      <w:r>
-        <w:t>We outline our intended plan in more detail below along with the authorship list. While our author list is larger than typical for TREE, we believe we have brought together a complementary</w:t>
-      </w:r>
-      <w:r>
-        <w:rPr>
-          <w:u w:val="single"/>
-        </w:rPr>
-        <w:t xml:space="preserve"> </w:t>
-      </w:r>
-      <w:r>
-        <w:t>cast of leading researchers across these fields with expertise in modelling that is needed for such a synthesis. We hope that you find our proposal as exciting as we do and look forward to hearing your response.  </w:t>
-      </w:r>
-    </w:p>
-    <w:p>
-      <w:r>
-        <w:t> </w:t>
-      </w:r>
-    </w:p>
-    <w:p>
-      <w:r>
-        <w:t>Sincerely,  </w:t>
-      </w:r>
-    </w:p>
-    <w:p>
-      <w:r>
-        <w:t>Daniel Noble (on behalf of all co-authors) </w:t>
-      </w:r>
-    </w:p>
-    <w:p>
-      <w:r>
-        <w:t> </w:t>
-      </w:r>
-    </w:p>
-    <w:p>
-      <w:r>
-        <w:t xml:space="preserve">While conceptual frameworks around how extreme heat will impact biological systems exist (e.g., </w:t>
-      </w:r>
-      <w:proofErr w:type="spellStart"/>
-      <w:r>
-        <w:t>Martı́nez-De</w:t>
-      </w:r>
-      <w:proofErr w:type="spellEnd"/>
-      <w:r>
-        <w:t xml:space="preserve"> León et al. 2024), the problem remains that we lack quantitative modelling approaches that can capture the multifaceted ways in which it will shape and re-shape biodiversity, community composition and ecosystem services. Indeed, one of the outstanding questions proposed by </w:t>
-      </w:r>
-      <w:proofErr w:type="spellStart"/>
-      <w:r>
-        <w:t>Martı́nez-De</w:t>
-      </w:r>
-      <w:proofErr w:type="spellEnd"/>
-      <w:r>
-        <w:t xml:space="preserve"> León et al. 2024 was “</w:t>
+        <w:t xml:space="preserve">major </w:t>
+      </w:r>
+      <w:r>
+        <w:t xml:space="preserve">outstanding question </w:t>
+      </w:r>
+      <w:r>
+        <w:t xml:space="preserve">that remains is: </w:t>
       </w:r>
       <w:r>
         <w:rPr>
@@ -229,7 +109,408 @@
         <w:t>How can variation in ecological responses to heat extremes be predicted?</w:t>
       </w:r>
       <w:r>
-        <w:t>”.  </w:t>
+        <w:t xml:space="preserve"> [</w:t>
+      </w:r>
+      <w:r>
+        <w:t>4</w:t>
+      </w:r>
+      <w:r>
+        <w:t>]</w:t>
+      </w:r>
+      <w:r>
+        <w:t xml:space="preserve">. </w:t>
+      </w:r>
+      <w:r>
+        <w:t xml:space="preserve">Tackling this question requires greater interoperability among models </w:t>
+      </w:r>
+      <w:r>
+        <w:t>from</w:t>
+      </w:r>
+      <w:r>
+        <w:t xml:space="preserve"> diverse fields</w:t>
+      </w:r>
+      <w:r>
+        <w:t xml:space="preserve"> that each </w:t>
+      </w:r>
+      <w:r>
+        <w:t>provide important</w:t>
+      </w:r>
+      <w:r>
+        <w:t xml:space="preserve"> predictive </w:t>
+      </w:r>
+      <w:r>
+        <w:t>capacity</w:t>
+      </w:r>
+      <w:r>
+        <w:t xml:space="preserve"> for </w:t>
+      </w:r>
+      <w:r>
+        <w:t>diverse species within</w:t>
+      </w:r>
+      <w:r>
+        <w:t xml:space="preserve"> </w:t>
+      </w:r>
+      <w:r>
+        <w:t xml:space="preserve">a </w:t>
+      </w:r>
+      <w:r>
+        <w:t>community</w:t>
+      </w:r>
+      <w:r>
+        <w:t>.</w:t>
+      </w:r>
+      <w:r>
+        <w:t xml:space="preserve"> </w:t>
+      </w:r>
+      <w:r>
+        <w:t>Until now</w:t>
+      </w:r>
+      <w:r>
+        <w:t xml:space="preserve">, </w:t>
+      </w:r>
+      <w:r>
+        <w:t>the development of these models</w:t>
+      </w:r>
+      <w:r>
+        <w:t xml:space="preserve"> </w:t>
+      </w:r>
+      <w:r>
+        <w:t>has</w:t>
+      </w:r>
+      <w:r>
+        <w:t xml:space="preserve"> largely </w:t>
+      </w:r>
+      <w:r>
+        <w:t>ignored the</w:t>
+      </w:r>
+      <w:r>
+        <w:t xml:space="preserve"> ways in which they can </w:t>
+      </w:r>
+      <w:r>
+        <w:t>‘c</w:t>
+      </w:r>
+      <w:r>
+        <w:t>ommunicate</w:t>
+      </w:r>
+      <w:r>
+        <w:t>’</w:t>
+      </w:r>
+      <w:r>
+        <w:t xml:space="preserve"> </w:t>
+      </w:r>
+      <w:r>
+        <w:t xml:space="preserve">with each other </w:t>
+      </w:r>
+      <w:r>
+        <w:t xml:space="preserve">to provide a </w:t>
+      </w:r>
+      <w:r>
+        <w:t xml:space="preserve">more robust </w:t>
+      </w:r>
+      <w:r>
+        <w:t>systems</w:t>
+      </w:r>
+      <w:r>
+        <w:t>-</w:t>
+      </w:r>
+      <w:r>
+        <w:t xml:space="preserve">modelling </w:t>
+      </w:r>
+      <w:r>
+        <w:t>framework</w:t>
+      </w:r>
+      <w:r>
+        <w:t xml:space="preserve">. </w:t>
+      </w:r>
+      <w:r>
+        <w:t>A s</w:t>
+      </w:r>
+      <w:r>
+        <w:t>ystem</w:t>
+      </w:r>
+      <w:r>
+        <w:t>s-modelling</w:t>
+      </w:r>
+      <w:r>
+        <w:t xml:space="preserve"> </w:t>
+      </w:r>
+      <w:r>
+        <w:t>approach</w:t>
+      </w:r>
+      <w:r>
+        <w:t xml:space="preserve"> </w:t>
+      </w:r>
+      <w:r>
+        <w:t xml:space="preserve">that </w:t>
+      </w:r>
+      <w:r>
+        <w:t>integrate</w:t>
+      </w:r>
+      <w:r>
+        <w:t>s</w:t>
+      </w:r>
+      <w:r>
+        <w:t xml:space="preserve"> the strengths of </w:t>
+      </w:r>
+      <w:r>
+        <w:t>field-specific</w:t>
+      </w:r>
+      <w:r>
+        <w:t xml:space="preserve"> models will be </w:t>
+      </w:r>
+      <w:r>
+        <w:t>better able to capture the diverse ways extreme heat can</w:t>
+      </w:r>
+      <w:r>
+        <w:t>,</w:t>
+      </w:r>
+      <w:r>
+        <w:t xml:space="preserve"> and will</w:t>
+      </w:r>
+      <w:r>
+        <w:t>,</w:t>
+      </w:r>
+      <w:r>
+        <w:t xml:space="preserve"> perturb </w:t>
+      </w:r>
+      <w:r>
+        <w:t xml:space="preserve">ecological </w:t>
+      </w:r>
+      <w:r>
+        <w:t>communities</w:t>
+      </w:r>
+      <w:r>
+        <w:t xml:space="preserve">. </w:t>
+      </w:r>
+    </w:p>
+    <w:p/>
+    <w:p>
+      <w:r>
+        <w:t>We have brought together a multidisciplinary team of leading plant and animal biologists with expertise in various fields (</w:t>
+      </w:r>
+      <w:r>
+        <w:t>eco</w:t>
+      </w:r>
+      <w:r>
+        <w:t xml:space="preserve">physiology, </w:t>
+      </w:r>
+      <w:r>
+        <w:t xml:space="preserve">community, population and ecosystem </w:t>
+      </w:r>
+      <w:r>
+        <w:t xml:space="preserve">ecology, </w:t>
+      </w:r>
+      <w:r>
+        <w:t xml:space="preserve">and </w:t>
+      </w:r>
+      <w:r>
+        <w:t>evolutio</w:t>
+      </w:r>
+      <w:r>
+        <w:t>n</w:t>
+      </w:r>
+      <w:r>
+        <w:t xml:space="preserve">) to </w:t>
+      </w:r>
+      <w:r>
+        <w:t xml:space="preserve">tackle the challenge of </w:t>
+      </w:r>
+      <w:r>
+        <w:t xml:space="preserve">how we can develop ways </w:t>
+      </w:r>
+      <w:r>
+        <w:t xml:space="preserve">that </w:t>
+      </w:r>
+      <w:r>
+        <w:t>models can better communicate with each other</w:t>
+      </w:r>
+      <w:r>
+        <w:t xml:space="preserve">. Our ideas emerged from two in person workshops held in 2024. Our Opinion piece will discuss our vision for an integrated quantitative modelling framework </w:t>
+      </w:r>
+      <w:r>
+        <w:t>that use</w:t>
+      </w:r>
+      <w:r>
+        <w:t>s</w:t>
+      </w:r>
+      <w:r>
+        <w:t xml:space="preserve"> models from disparate fields </w:t>
+      </w:r>
+      <w:r>
+        <w:t xml:space="preserve">to calculate the effects of extreme heat on diverse organisms (plants and animals). </w:t>
+      </w:r>
+      <w:r>
+        <w:t>We will show how</w:t>
+      </w:r>
+      <w:r>
+        <w:t xml:space="preserve"> quantitative predictions that use coupled mechanistic models </w:t>
+      </w:r>
+      <w:r>
+        <w:t>[</w:t>
+      </w:r>
+      <w:r>
+        <w:t>biophysical models of heat and mass exchange, Dynamic Energy Budget Theory –</w:t>
+      </w:r>
+      <w:r>
+        <w:rPr>
+          <w:rFonts w:ascii="Arial" w:hAnsi="Arial" w:cs="Arial"/>
+        </w:rPr>
+        <w:t xml:space="preserve"> 5–7</w:t>
+      </w:r>
+      <w:r>
+        <w:t>]</w:t>
+      </w:r>
+      <w:r>
+        <w:t xml:space="preserve"> can be combined with physiological </w:t>
+      </w:r>
+      <w:r>
+        <w:t>[</w:t>
+      </w:r>
+      <w:r>
+        <w:t>e.g., thermal death time models –</w:t>
+      </w:r>
+      <w:r>
+        <w:rPr>
+          <w:rFonts w:ascii="Arial" w:hAnsi="Arial" w:cs="Arial"/>
+        </w:rPr>
+        <w:t> </w:t>
+      </w:r>
+      <w:r>
+        <w:t xml:space="preserve">e.g., </w:t>
+      </w:r>
+      <w:r>
+        <w:t>8–9]</w:t>
+      </w:r>
+      <w:r>
+        <w:t xml:space="preserve"> and population/community ecology models</w:t>
+      </w:r>
+      <w:r>
+        <w:t xml:space="preserve"> to predict systemwide perturbations of heatwave events</w:t>
+      </w:r>
+      <w:r>
+        <w:t>. Importantly, we will</w:t>
+      </w:r>
+      <w:r>
+        <w:t xml:space="preserve"> also </w:t>
+      </w:r>
+      <w:r>
+        <w:t xml:space="preserve">identify ways to incorporate </w:t>
+      </w:r>
+      <w:r>
+        <w:t>recognised</w:t>
+      </w:r>
+      <w:r>
+        <w:t xml:space="preserve"> biological responses and environmental mediators into our proposed modelling framework (e.g., how thermal sensitivity can be mediated by microbes, water availability</w:t>
+      </w:r>
+      <w:r>
+        <w:t xml:space="preserve">, </w:t>
+      </w:r>
+      <w:r>
+        <w:t>plasticity</w:t>
+      </w:r>
+      <w:r>
+        <w:t xml:space="preserve"> and evolution</w:t>
+      </w:r>
+      <w:r>
+        <w:t>)</w:t>
+      </w:r>
+      <w:r>
+        <w:t>. Our approach is unique in that it will provide</w:t>
+      </w:r>
+      <w:r>
+        <w:t xml:space="preserve"> clear connections between conceptual frameworks </w:t>
+      </w:r>
+      <w:r>
+        <w:t xml:space="preserve">[e.g., 4], </w:t>
+      </w:r>
+      <w:r>
+        <w:t xml:space="preserve">and the models that make quantitative predictions </w:t>
+      </w:r>
+      <w:r>
+        <w:t>about</w:t>
+      </w:r>
+      <w:r>
+        <w:t xml:space="preserve"> </w:t>
+      </w:r>
+      <w:r>
+        <w:t xml:space="preserve">how a system </w:t>
+      </w:r>
+      <w:r>
+        <w:t>respon</w:t>
+      </w:r>
+      <w:r>
+        <w:t>ds</w:t>
+      </w:r>
+      <w:r>
+        <w:t xml:space="preserve"> to extreme heat.</w:t>
+      </w:r>
+      <w:r>
+        <w:t xml:space="preserve"> Our proposed</w:t>
+      </w:r>
+      <w:r>
+        <w:t xml:space="preserve"> modelling framework can </w:t>
+      </w:r>
+      <w:r>
+        <w:t xml:space="preserve">also </w:t>
+      </w:r>
+      <w:r>
+        <w:t>be used for developing interventions that maintain resilience of biological and agricultural systems in the face of extreme heat</w:t>
+      </w:r>
+      <w:r>
+        <w:t xml:space="preserve">, and we will discuss </w:t>
+      </w:r>
+      <w:r>
+        <w:t xml:space="preserve">promising </w:t>
+      </w:r>
+      <w:r>
+        <w:t>applications within that space</w:t>
+      </w:r>
+      <w:r>
+        <w:t>.</w:t>
+      </w:r>
+    </w:p>
+    <w:p/>
+    <w:p>
+      <w:r>
+        <w:t xml:space="preserve">We outline our intended plan in more detail below along with the authorship list. While our author list is larger than typical for TREE, this piece has been developed by a large interdisciplinary group who are all actively participating in the development of this paper. Because one of the main features of this paper is to illustrate the added value of working across multiple disciplines, it is essential that we include representatives from those fields </w:t>
+      </w:r>
+      <w:r>
+        <w:t>i</w:t>
+      </w:r>
+      <w:r>
+        <w:t xml:space="preserve">n our author list. </w:t>
+      </w:r>
+      <w:r>
+        <w:t>We believe that there are now exciting, un-tapped opportunities to integrate modelling frameworks</w:t>
+      </w:r>
+      <w:r>
+        <w:t xml:space="preserve"> which will have implications for understanding how extreme heat impact</w:t>
+      </w:r>
+      <w:r>
+        <w:t>s</w:t>
+      </w:r>
+      <w:r>
+        <w:t xml:space="preserve"> </w:t>
+      </w:r>
+      <w:r>
+        <w:t xml:space="preserve">ecological systems, and </w:t>
+      </w:r>
+      <w:r>
+        <w:t xml:space="preserve">on socioecological systems more generally. </w:t>
+      </w:r>
+      <w:r>
+        <w:t>We hope that you find our proposal as exciting as we do and look forward to hearing your response.</w:t>
+      </w:r>
+    </w:p>
+    <w:p/>
+    <w:p>
+      <w:r>
+        <w:t>Sincerely,  </w:t>
+      </w:r>
+    </w:p>
+    <w:p>
+      <w:r>
+        <w:t>Daniel Noble (on behalf of all co-authors) </w:t>
       </w:r>
     </w:p>
     <w:p/>
@@ -242,90 +523,307 @@
       </w:pPr>
     </w:p>
     <w:p>
-      <w:pPr>
+      <w:r>
         <w:rPr>
           <w:b/>
           <w:bCs/>
         </w:rPr>
-      </w:pPr>
-    </w:p>
-    <w:p>
-      <w:r>
+        <w:lastRenderedPageBreak/>
+        <w:t>Authors</w:t>
+      </w:r>
+      <w:r>
+        <w:t>:</w:t>
+      </w:r>
+    </w:p>
+    <w:p>
+      <w:r>
+        <w:t>Daniel W.A. Noble</w:t>
+      </w:r>
+      <w:r>
+        <w:rPr>
+          <w:vertAlign w:val="superscript"/>
+        </w:rPr>
+        <w:t>1</w:t>
+      </w:r>
+      <w:r>
+        <w:t>, Micheal R. Kearney</w:t>
+      </w:r>
+      <w:r>
+        <w:rPr>
+          <w:vertAlign w:val="superscript"/>
+        </w:rPr>
+        <w:t>2</w:t>
+      </w:r>
+      <w:r>
+        <w:t>, Belinda Medlyn</w:t>
+      </w:r>
+      <w:r>
+        <w:rPr>
+          <w:vertAlign w:val="superscript"/>
+        </w:rPr>
+        <w:t>3</w:t>
+      </w:r>
+      <w:r>
+        <w:t>, Margaret Mayfield</w:t>
+      </w:r>
+      <w:r>
+        <w:rPr>
+          <w:vertAlign w:val="superscript"/>
+        </w:rPr>
+        <w:t>2</w:t>
+      </w:r>
+      <w:r>
+        <w:t>, Ary Hoffmann</w:t>
+      </w:r>
+      <w:r>
+        <w:rPr>
+          <w:vertAlign w:val="superscript"/>
+        </w:rPr>
+        <w:t>1</w:t>
+      </w:r>
+      <w:r>
+        <w:t>, James Cook</w:t>
+      </w:r>
+      <w:r>
+        <w:rPr>
+          <w:vertAlign w:val="superscript"/>
+        </w:rPr>
+        <w:t>3</w:t>
+      </w:r>
+      <w:r>
+        <w:t>, Brajesh Singh</w:t>
+      </w:r>
+      <w:r>
+        <w:rPr>
+          <w:vertAlign w:val="superscript"/>
+        </w:rPr>
+        <w:t>3</w:t>
+      </w:r>
+      <w:r>
+        <w:t>, Adrienne Nicotra</w:t>
+      </w:r>
+      <w:r>
+        <w:rPr>
+          <w:vertAlign w:val="superscript"/>
+        </w:rPr>
+        <w:t>1,4</w:t>
+      </w:r>
+      <w:r>
+        <w:t>, Brendan Choat</w:t>
+      </w:r>
+      <w:r>
+        <w:rPr>
+          <w:vertAlign w:val="superscript"/>
+        </w:rPr>
+        <w:t>3</w:t>
+      </w:r>
+      <w:r>
+        <w:t>, Owen Atkin</w:t>
+      </w:r>
+      <w:r>
+        <w:rPr>
+          <w:vertAlign w:val="superscript"/>
+        </w:rPr>
+        <w:t>4</w:t>
+      </w:r>
+      <w:r>
+        <w:t>, Barry Pogson</w:t>
+      </w:r>
+      <w:r>
+        <w:rPr>
+          <w:vertAlign w:val="superscript"/>
+        </w:rPr>
+        <w:t>4</w:t>
+      </w:r>
+      <w:r>
+        <w:t>, Danielle Way</w:t>
+      </w:r>
+      <w:r>
+        <w:rPr>
+          <w:vertAlign w:val="superscript"/>
+        </w:rPr>
+        <w:t>4</w:t>
+      </w:r>
+      <w:r>
+        <w:t>, Alison Bentley</w:t>
+      </w:r>
+      <w:r>
+        <w:rPr>
+          <w:vertAlign w:val="superscript"/>
+        </w:rPr>
+        <w:t>4</w:t>
+      </w:r>
+      <w:r>
+        <w:t>, Ian Wright</w:t>
+      </w:r>
+      <w:r>
+        <w:rPr>
+          <w:vertAlign w:val="superscript"/>
+        </w:rPr>
+        <w:t>3</w:t>
+      </w:r>
+      <w:r>
+        <w:t xml:space="preserve">, </w:t>
+      </w:r>
+      <w:proofErr w:type="spellStart"/>
+      <w:r>
+        <w:t>Xuemei</w:t>
+      </w:r>
+      <w:proofErr w:type="spellEnd"/>
+      <w:r>
+        <w:t xml:space="preserve"> Bai</w:t>
+      </w:r>
+      <w:r>
+        <w:rPr>
+          <w:vertAlign w:val="superscript"/>
+        </w:rPr>
+        <w:t>5</w:t>
+      </w:r>
+      <w:r>
+        <w:t>, Kate Henne, Philippa Collin, Zhonghua Chen</w:t>
+      </w:r>
+      <w:r>
+        <w:rPr>
+          <w:vertAlign w:val="superscript"/>
+        </w:rPr>
+        <w:t>3</w:t>
+      </w:r>
+      <w:r>
+        <w:t>, Joan Leach, Steven Lade</w:t>
+      </w:r>
+      <w:r>
+        <w:rPr>
+          <w:vertAlign w:val="superscript"/>
+        </w:rPr>
+        <w:t>5</w:t>
+      </w:r>
+      <w:r>
+        <w:t xml:space="preserve"> </w:t>
+      </w:r>
+    </w:p>
+    <w:p>
+      <w:r>
+        <w:t xml:space="preserve"> </w:t>
+      </w:r>
+    </w:p>
+    <w:p>
+      <w:r>
+        <w:t xml:space="preserve">Affiliations: </w:t>
+      </w:r>
+    </w:p>
+    <w:p>
+      <w:r>
+        <w:rPr>
+          <w:vertAlign w:val="superscript"/>
+        </w:rPr>
+        <w:t>1</w:t>
+      </w:r>
+      <w:r>
+        <w:t xml:space="preserve"> Division of Ecology and Evolution, Research School of Biology, The Australian National University, Canberra ACT 2602 </w:t>
+      </w:r>
+    </w:p>
+    <w:p>
+      <w:r>
+        <w:rPr>
+          <w:vertAlign w:val="superscript"/>
+        </w:rPr>
+        <w:t>2</w:t>
+      </w:r>
+      <w:r>
+        <w:t xml:space="preserve"> School of Biosciences, The University of Melbourne.  </w:t>
+      </w:r>
+    </w:p>
+    <w:p>
+      <w:r>
+        <w:rPr>
+          <w:vertAlign w:val="superscript"/>
+        </w:rPr>
+        <w:t>3</w:t>
+      </w:r>
+      <w:r>
+        <w:t xml:space="preserve"> Hawksbury Institute for the Environment, Western Sydney University  </w:t>
+      </w:r>
+    </w:p>
+    <w:p>
+      <w:r>
+        <w:rPr>
+          <w:vertAlign w:val="superscript"/>
+        </w:rPr>
+        <w:t>4</w:t>
+      </w:r>
+      <w:r>
+        <w:t xml:space="preserve"> Division of Plant Sciences, Research School of Biology, The Australian National University, Canberra ACT 2602 </w:t>
+      </w:r>
+    </w:p>
+    <w:p>
+      <w:r>
+        <w:rPr>
+          <w:vertAlign w:val="superscript"/>
+        </w:rPr>
+        <w:t>5</w:t>
+      </w:r>
+      <w:r>
+        <w:t xml:space="preserve"> Fenner School of Environment and Society, The Australian National University, Canberra ACT 2602 </w:t>
+      </w:r>
+    </w:p>
+    <w:p/>
+    <w:p>
+      <w:pPr>
         <w:rPr>
           <w:b/>
           <w:bCs/>
         </w:rPr>
-        <w:t>Proposal</w:t>
-      </w:r>
-      <w:r>
-        <w:t>:</w:t>
-      </w:r>
-    </w:p>
-    <w:p>
+      </w:pPr>
       <w:r>
         <w:rPr>
           <w:b/>
           <w:bCs/>
         </w:rPr>
-        <w:t>Authors</w:t>
-      </w:r>
-      <w:r>
-        <w:t>:</w:t>
-      </w:r>
-    </w:p>
-    <w:p>
-      <w:r>
-        <w:t xml:space="preserve">Daniel W.A. Noble, Micheal R. Kearney, Belinda </w:t>
-      </w:r>
-      <w:proofErr w:type="spellStart"/>
-      <w:r>
-        <w:t>Medlyn</w:t>
-      </w:r>
-      <w:proofErr w:type="spellEnd"/>
-      <w:r>
-        <w:t xml:space="preserve">, </w:t>
-      </w:r>
-      <w:r>
-        <w:t>Marg</w:t>
-      </w:r>
-      <w:r>
-        <w:t>a</w:t>
-      </w:r>
-      <w:r>
-        <w:t>ret Mayfield</w:t>
-      </w:r>
-      <w:r>
-        <w:t xml:space="preserve">, Ary Hoffmann, James Cook, Brajesh Singh, Adrienne Nicotra, Brendan </w:t>
-      </w:r>
-      <w:proofErr w:type="spellStart"/>
-      <w:r>
-        <w:t>Choat</w:t>
-      </w:r>
-      <w:proofErr w:type="spellEnd"/>
-      <w:r>
-        <w:t xml:space="preserve">, </w:t>
-      </w:r>
-      <w:r>
-        <w:t xml:space="preserve">Owen Atkin, </w:t>
-      </w:r>
-      <w:r>
-        <w:t xml:space="preserve">Barry </w:t>
-      </w:r>
-      <w:proofErr w:type="spellStart"/>
-      <w:r>
-        <w:t>Pogson</w:t>
-      </w:r>
-      <w:proofErr w:type="spellEnd"/>
-      <w:r>
-        <w:t xml:space="preserve">, Danielle Way, Alison Bentley, Ian Wright, </w:t>
-      </w:r>
-      <w:proofErr w:type="spellStart"/>
-      <w:r>
-        <w:t>Xuemei</w:t>
-      </w:r>
-      <w:proofErr w:type="spellEnd"/>
-      <w:r>
-        <w:t xml:space="preserve"> Bai, Kate Henne, Philippa Collin, Zhonghua Chen, Joan Leach, Steven Lade</w:t>
+        <w:t>Abstract</w:t>
+      </w:r>
+    </w:p>
+    <w:p>
+      <w:pPr>
+        <w:rPr>
+          <w:rFonts w:ascii="Arial" w:hAnsi="Arial" w:cs="Arial"/>
+        </w:rPr>
+      </w:pPr>
+      <w:r>
+        <w:rPr>
+          <w:lang w:val="en-US"/>
+        </w:rPr>
+        <w:t xml:space="preserve">Anthropogenic climate change is leading to more frequent and extreme heat waves. These short-term but large-scale events are radically re-shaping interactions among organisms, impacting biodiversity, community composition and ecosystem services crucial to natural systems and food security. Predicting heat wave impacts on interacting species requires an understanding of the processes driving differential exposure and sensitivity of organisms to extreme heat events in a life-cycle context. But this, in turn, requires a modelling framework that can capture species-specific responses via habitat-mediated microclimates, biophysics of body temperature, physiological sensitivity, and its effects on vital rates across ontogeny and thermal history. We show how existing models in disparate fields can be linked to achieve this level of understanding to allow </w:t>
+      </w:r>
+      <w:r>
+        <w:rPr>
+          <w:lang w:val="en-US"/>
+        </w:rPr>
+        <w:t xml:space="preserve">for </w:t>
+      </w:r>
+      <w:r>
+        <w:rPr>
+          <w:lang w:val="en-US"/>
+        </w:rPr>
+        <w:t>calculated</w:t>
+      </w:r>
+      <w:r>
+        <w:rPr>
+          <w:u w:val="single"/>
+          <w:lang w:val="en-US"/>
+        </w:rPr>
+        <w:t xml:space="preserve"> </w:t>
+      </w:r>
+      <w:r>
+        <w:rPr>
+          <w:lang w:val="en-US"/>
+        </w:rPr>
+        <w:t>responses to extreme heat now and into the future.</w:t>
+      </w:r>
+      <w:r>
+        <w:rPr>
+          <w:rFonts w:ascii="Arial" w:hAnsi="Arial" w:cs="Arial"/>
+        </w:rPr>
+        <w:t> </w:t>
       </w:r>
     </w:p>
     <w:p>
@@ -335,113 +833,6 @@
           <w:bCs/>
         </w:rPr>
       </w:pPr>
-    </w:p>
-    <w:p>
-      <w:r>
-        <w:rPr>
-          <w:b/>
-          <w:bCs/>
-        </w:rPr>
-        <w:t>Affiliations</w:t>
-      </w:r>
-      <w:r>
-        <w:t>:</w:t>
-      </w:r>
-    </w:p>
-    <w:p>
-      <w:r>
-        <w:rPr>
-          <w:vertAlign w:val="superscript"/>
-        </w:rPr>
-        <w:t>1</w:t>
-      </w:r>
-      <w:r>
-        <w:t>Division of Ecology and Evolution, Research School of Biology, The Australian National University, Canberra ACT 2602</w:t>
-      </w:r>
-    </w:p>
-    <w:p>
-      <w:r>
-        <w:t xml:space="preserve">Department of Biosciences, The University of Melbourne. </w:t>
-      </w:r>
-    </w:p>
-    <w:p>
-      <w:r>
-        <w:t>Division of Plant Sciences, Research School of Biology, The Australian National University, Canberra ACT 2602</w:t>
-      </w:r>
-    </w:p>
-    <w:p>
-      <w:r>
-        <w:t xml:space="preserve">Fenner School of Environment and Society, </w:t>
-      </w:r>
-      <w:r>
-        <w:t>The Australian National University, Canberra ACT 2602</w:t>
-      </w:r>
-    </w:p>
-    <w:p>
-      <w:r>
-        <w:t>Hawksbury Institute for the Environment, Western Sydney University</w:t>
-      </w:r>
-    </w:p>
-    <w:p/>
-    <w:p>
-      <w:pPr>
-        <w:rPr>
-          <w:b/>
-          <w:bCs/>
-        </w:rPr>
-      </w:pPr>
-      <w:r>
-        <w:rPr>
-          <w:b/>
-          <w:bCs/>
-        </w:rPr>
-        <w:t>Abstract</w:t>
-      </w:r>
-    </w:p>
-    <w:p>
-      <w:pPr>
-        <w:rPr>
-          <w:b/>
-          <w:bCs/>
-        </w:rPr>
-      </w:pPr>
-      <w:r>
-        <w:rPr>
-          <w:lang w:val="en-US"/>
-        </w:rPr>
-        <w:t xml:space="preserve">Anthropogenic climate change is leading to more frequent and extreme heat waves. These short-term but large-scale events are radically re-shaping interactions among organisms, impacting biodiversity, community composition and ecosystem services crucial to natural systems and food security. Predicting heat wave impacts on interacting species requires an understanding of the processes driving differential exposure and sensitivity of organisms to extreme heat events in a life-cycle context. But this, in turn, requires a modelling framework that can capture species-specific responses via habitat-mediated microclimates, biophysics of body temperature, physiological sensitivity, and its effects on vital rates across ontogeny and thermal history. We show how existing models in disparate fields can be linked to achieve this level of understanding to allow </w:t>
-      </w:r>
-      <w:r>
-        <w:rPr>
-          <w:lang w:val="en-US"/>
-        </w:rPr>
-        <w:t xml:space="preserve">for </w:t>
-      </w:r>
-      <w:r>
-        <w:rPr>
-          <w:lang w:val="en-US"/>
-        </w:rPr>
-        <w:t>calculated</w:t>
-      </w:r>
-      <w:r>
-        <w:rPr>
-          <w:u w:val="single"/>
-          <w:lang w:val="en-US"/>
-        </w:rPr>
-        <w:t xml:space="preserve"> </w:t>
-      </w:r>
-      <w:r>
-        <w:rPr>
-          <w:lang w:val="en-US"/>
-        </w:rPr>
-        <w:t>responses to extreme heat now and into the future.</w:t>
-      </w:r>
-      <w:r>
-        <w:rPr>
-          <w:rFonts w:ascii="Arial" w:hAnsi="Arial" w:cs="Arial"/>
-        </w:rPr>
-        <w:t> </w:t>
-      </w:r>
     </w:p>
     <w:p>
       <w:pPr>
@@ -456,12 +847,11 @@
           <w:bCs/>
           <w:noProof/>
         </w:rPr>
-        <w:lastRenderedPageBreak/>
         <w:drawing>
-          <wp:inline distT="0" distB="0" distL="0" distR="0" wp14:anchorId="67F11397" wp14:editId="7DD85C4D">
-            <wp:extent cx="6254885" cy="4378666"/>
-            <wp:effectExtent l="0" t="0" r="0" b="3175"/>
-            <wp:docPr id="212276124" name="Picture 1"/>
+          <wp:inline distT="0" distB="0" distL="0" distR="0" wp14:anchorId="615BDD5E" wp14:editId="7A7F96EE">
+            <wp:extent cx="6475730" cy="4533265"/>
+            <wp:effectExtent l="0" t="0" r="1270" b="635"/>
+            <wp:docPr id="1919147103" name="Picture 1" descr="A diagram of a plant&#10;&#10;Description automatically generated"/>
             <wp:cNvGraphicFramePr>
               <a:graphicFrameLocks xmlns:a="http://schemas.openxmlformats.org/drawingml/2006/main" noChangeAspect="1"/>
             </wp:cNvGraphicFramePr>
@@ -469,7 +859,7 @@
               <a:graphicData uri="http://schemas.openxmlformats.org/drawingml/2006/picture">
                 <pic:pic xmlns:pic="http://schemas.openxmlformats.org/drawingml/2006/picture">
                   <pic:nvPicPr>
-                    <pic:cNvPr id="212276124" name="Picture 212276124"/>
+                    <pic:cNvPr id="1919147103" name="Picture 1" descr="A diagram of a plant&#10;&#10;Description automatically generated"/>
                     <pic:cNvPicPr/>
                   </pic:nvPicPr>
                   <pic:blipFill>
@@ -487,7 +877,7 @@
                   <pic:spPr>
                     <a:xfrm>
                       <a:off x="0" y="0"/>
-                      <a:ext cx="6298960" cy="4409520"/>
+                      <a:ext cx="6475730" cy="4533265"/>
                     </a:xfrm>
                     <a:prstGeom prst="rect">
                       <a:avLst/>
@@ -506,6 +896,7 @@
           <w:b/>
           <w:bCs/>
         </w:rPr>
+        <w:lastRenderedPageBreak/>
         <w:t>Figure</w:t>
       </w:r>
       <w:r>
@@ -516,55 +907,10 @@
         <w:t xml:space="preserve"> 1</w:t>
       </w:r>
       <w:r>
-        <w:t xml:space="preserve">: The proposed modelling integration developed in our Review paper that integrates climate/biophysical models to predict exposure temperatures of species within communities. Exposure temperatures provide </w:t>
-      </w:r>
-      <w:r>
-        <w:t>inputs for</w:t>
-      </w:r>
-      <w:r>
-        <w:t xml:space="preserve"> damage-repair and dynamic energy budget models that integrate temperature exposure with explicit physiological models that simulate development, behaviour, survival and reproduction in response to temperature across ontogeny. Physiological models can be built around the unique </w:t>
-      </w:r>
-      <w:r>
-        <w:t>life cycles</w:t>
-      </w:r>
-      <w:r>
-        <w:t xml:space="preserve"> </w:t>
-      </w:r>
-      <w:r>
-        <w:t>o</w:t>
-      </w:r>
-      <w:r>
-        <w:t>f the diverse species in communities capturing lagged responses to extreme heat</w:t>
-      </w:r>
-      <w:r>
-        <w:t xml:space="preserve">, phenological mismatches and mechanistically informed responses to </w:t>
-      </w:r>
-      <w:r>
-        <w:t>extreme heat for species</w:t>
-      </w:r>
-      <w:r>
-        <w:t xml:space="preserve"> of the system in question.</w:t>
-      </w:r>
-      <w:r>
-        <w:t xml:space="preserve"> </w:t>
-      </w:r>
-      <w:r>
-        <w:t xml:space="preserve">Outputs (behaviour, survival, reproduction) from physiological models can then </w:t>
-      </w:r>
-      <w:r>
-        <w:t>be integrated into</w:t>
-      </w:r>
-      <w:r>
-        <w:t xml:space="preserve"> population and community ecology models to predict population growth and community interactions for a given system</w:t>
-      </w:r>
-      <w:r>
-        <w:t xml:space="preserve"> change</w:t>
-      </w:r>
-      <w:r>
-        <w:t xml:space="preserve">. We also show how key environmental mediators feedback to influence exposure and sensitivity (e.g., water availability, microbiota) to influence different lief stages and organs. Integrated frameworks such as this provide exciting new opportunities to </w:t>
-      </w:r>
-      <w:r>
-        <w:t>run simulations on communities to make calculated, quantitative predictions on system perturbations, and implement localised solutions that can have system-wide effects on resilience to extreme heat.</w:t>
+        <w:t xml:space="preserve">: </w:t>
+      </w:r>
+      <w:r>
+        <w:t>The proposed modelling integration developed in our Opinion paper that integrates climate/biophysical models to predict exposure temperatures of species within communities. Exposure temperatures provide inputs for damage-repair and dynamic energy budget models that integrate temperature exposure with explicit physiological models that simulate development, behaviour, survival and reproduction in response to temperature across ontogeny. Physiological models can be built around the unique life cycles of the diverse species in communities capturing lagged responses to extreme heat, phenological mismatches and mechanistically informed responses to extreme heat for species of the system in question. Outputs (behaviour, survival, reproduction) from physiological models can then be integrated into population and community ecology models to predict population growth and community interactions for a given system change. We also show how key environmental mediators feedback to influence exposure and sensitivity (e.g., water availability, microbiota) to influence different life stages and organs. Integrated frameworks such as this provide exciting new opportunities to run simulations on communities to make quantitative predictions for system perturbations and implement localised solutions that can have system-wide effects on resilience to extreme heat.</w:t>
       </w:r>
     </w:p>
     <w:p>
@@ -717,7 +1063,6 @@
         </w:numPr>
       </w:pPr>
       <w:r>
-        <w:lastRenderedPageBreak/>
         <w:t>Incorporating environmental feedback to evaluate resilience to extreme heat</w:t>
       </w:r>
     </w:p>
@@ -747,34 +1092,153 @@
     </w:p>
     <w:p/>
     <w:p>
-      <w:r>
+      <w:pPr>
         <w:rPr>
           <w:b/>
           <w:bCs/>
         </w:rPr>
-        <w:t>Author Bios</w:t>
-      </w:r>
-      <w:r>
-        <w:t>:</w:t>
-      </w:r>
-    </w:p>
-    <w:p/>
-    <w:p>
-      <w:pPr>
+      </w:pPr>
+      <w:r>
         <w:rPr>
           <w:b/>
           <w:bCs/>
         </w:rPr>
+        <w:t>References</w:t>
+      </w:r>
+    </w:p>
+    <w:p>
+      <w:pPr>
+        <w:pStyle w:val="Bibliography"/>
       </w:pPr>
       <w:r>
-        <w:rPr>
-          <w:b/>
-          <w:bCs/>
-        </w:rPr>
-        <w:t>References</w:t>
-      </w:r>
-    </w:p>
-    <w:p>
+        <w:t>1</w:t>
+      </w:r>
+      <w:r>
+        <w:t>.</w:t>
+      </w:r>
+      <w:r>
+        <w:t xml:space="preserve"> Reichstein, M. </w:t>
+      </w:r>
+      <w:r>
+        <w:rPr>
+          <w:i/>
+          <w:iCs/>
+        </w:rPr>
+        <w:t>et al.</w:t>
+      </w:r>
+      <w:r>
+        <w:t xml:space="preserve"> (2007) Reduction of ecosystem productivity and respiration during the </w:t>
+      </w:r>
+      <w:r>
+        <w:t>E</w:t>
+      </w:r>
+      <w:r>
+        <w:t xml:space="preserve">uropean summer 2003 climate anomaly: A joint flux tower, remote sensing and modelling analysis. </w:t>
+      </w:r>
+      <w:r>
+        <w:rPr>
+          <w:i/>
+          <w:iCs/>
+        </w:rPr>
+        <w:t>Global Change Biology</w:t>
+      </w:r>
+      <w:r>
+        <w:t xml:space="preserve"> 13, 634–651</w:t>
+      </w:r>
+    </w:p>
+    <w:p/>
+    <w:p>
+      <w:pPr>
+        <w:pStyle w:val="Bibliography"/>
+      </w:pPr>
+      <w:r>
+        <w:t>2</w:t>
+      </w:r>
+      <w:r>
+        <w:t>.</w:t>
+      </w:r>
+      <w:r>
+        <w:t xml:space="preserve"> Bastos, A. </w:t>
+      </w:r>
+      <w:r>
+        <w:rPr>
+          <w:i/>
+          <w:iCs/>
+        </w:rPr>
+        <w:t>et al.</w:t>
+      </w:r>
+      <w:r>
+        <w:t xml:space="preserve"> (2014) Analysing the </w:t>
+      </w:r>
+      <w:proofErr w:type="spellStart"/>
+      <w:r>
+        <w:t>spatio</w:t>
+      </w:r>
+      <w:proofErr w:type="spellEnd"/>
+      <w:r>
+        <w:t xml:space="preserve">-temporal impacts of the 2003 and 2010 extreme heatwaves on plant productivity in </w:t>
+      </w:r>
+      <w:r>
+        <w:t>E</w:t>
+      </w:r>
+      <w:r>
+        <w:t xml:space="preserve">urope. </w:t>
+      </w:r>
+      <w:proofErr w:type="spellStart"/>
+      <w:r>
+        <w:rPr>
+          <w:i/>
+          <w:iCs/>
+        </w:rPr>
+        <w:t>Biogeosciences</w:t>
+      </w:r>
+      <w:proofErr w:type="spellEnd"/>
+      <w:r>
+        <w:t xml:space="preserve"> 11, 3421–3435</w:t>
+      </w:r>
+    </w:p>
+    <w:p/>
+    <w:p>
+      <w:r>
+        <w:t>3</w:t>
+      </w:r>
+      <w:r>
+        <w:t xml:space="preserve">. </w:t>
+      </w:r>
+      <w:proofErr w:type="spellStart"/>
+      <w:r>
+        <w:t>Margalef-Marrase</w:t>
+      </w:r>
+      <w:proofErr w:type="spellEnd"/>
+      <w:r>
+        <w:t xml:space="preserve">, J. </w:t>
+      </w:r>
+      <w:r>
+        <w:rPr>
+          <w:i/>
+          <w:iCs/>
+        </w:rPr>
+        <w:t>et al.</w:t>
+      </w:r>
+      <w:r>
+        <w:t xml:space="preserve"> (2020) Relationship between heatwave-induced forest die-off and climatic suitability in multiple tree species. </w:t>
+      </w:r>
+      <w:r>
+        <w:rPr>
+          <w:i/>
+          <w:iCs/>
+        </w:rPr>
+        <w:t>Global Change Biology</w:t>
+      </w:r>
+      <w:r>
+        <w:t xml:space="preserve"> 26, 3134–3146</w:t>
+      </w:r>
+    </w:p>
+    <w:p/>
+    <w:p>
+      <w:r>
+        <w:t xml:space="preserve">4. </w:t>
+      </w:r>
       <w:proofErr w:type="spellStart"/>
       <w:r>
         <w:t>Martı́nez-De</w:t>
@@ -813,6 +1277,12 @@
           <w:iCs/>
         </w:rPr>
       </w:pPr>
+      <w:r>
+        <w:rPr>
+          <w:lang w:val="en-US"/>
+        </w:rPr>
+        <w:t xml:space="preserve">5. </w:t>
+      </w:r>
       <w:proofErr w:type="spellStart"/>
       <w:r>
         <w:rPr>
@@ -901,6 +1371,12 @@
         <w:rPr>
           <w:lang w:val="en-US"/>
         </w:rPr>
+        <w:t xml:space="preserve">6. </w:t>
+      </w:r>
+      <w:r>
+        <w:rPr>
+          <w:lang w:val="en-US"/>
+        </w:rPr>
         <w:t xml:space="preserve">Kearney, M.R. and Leigh, A. (2024) Fast, accurate and accessible calculations of leaf temperature and its physiological consequences with </w:t>
       </w:r>
       <w:proofErr w:type="spellStart"/>
@@ -943,6 +1419,12 @@
         <w:rPr>
           <w:lang w:val="en-US"/>
         </w:rPr>
+        <w:t xml:space="preserve">7. </w:t>
+      </w:r>
+      <w:r>
+        <w:rPr>
+          <w:lang w:val="en-US"/>
+        </w:rPr>
         <w:t xml:space="preserve">Briscoe, N.J. </w:t>
       </w:r>
       <w:r>
@@ -983,6 +1465,12 @@
         <w:rPr>
           <w:lang w:val="en-US"/>
         </w:rPr>
+        <w:t xml:space="preserve">8. </w:t>
+      </w:r>
+      <w:r>
+        <w:rPr>
+          <w:lang w:val="en-US"/>
+        </w:rPr>
         <w:t xml:space="preserve">Rezende, E.L. </w:t>
       </w:r>
       <w:r>
@@ -1025,6 +1513,12 @@
       </w:pPr>
     </w:p>
     <w:p>
+      <w:r>
+        <w:rPr>
+          <w:lang w:val="en-US"/>
+        </w:rPr>
+        <w:t xml:space="preserve">9. </w:t>
+      </w:r>
       <w:proofErr w:type="spellStart"/>
       <w:r>
         <w:rPr>
@@ -2197,6 +2691,15 @@
       <w:shd w:val="clear" w:color="auto" w:fill="E1DFDD"/>
     </w:rPr>
   </w:style>
+  <w:style w:type="paragraph" w:styleId="Bibliography">
+    <w:name w:val="Bibliography"/>
+    <w:basedOn w:val="Normal"/>
+    <w:next w:val="Normal"/>
+    <w:uiPriority w:val="37"/>
+    <w:semiHidden/>
+    <w:unhideWhenUsed/>
+    <w:rsid w:val="00033B0D"/>
+  </w:style>
 </w:styles>
 </file>
 

</xml_diff>

<commit_message>
flesh out the figure section
</commit_message>
<xml_diff>
--- a/ms/proposal.docx
+++ b/ms/proposal.docx
@@ -656,40 +656,115 @@
     <w:p/>
     <w:p>
       <w:r>
-        <w:t xml:space="preserve">In addition to an overarching conceptual figure </w:t>
-      </w:r>
-      <w:r>
-        <w:t xml:space="preserve">(Figure 1) </w:t>
-      </w:r>
-      <w:r>
-        <w:t xml:space="preserve">we </w:t>
-      </w:r>
-      <w:r>
-        <w:t xml:space="preserve">will include two additional figures (one detailing the models, and a second XX) along with two boxes. One box will detail an example of the distinct ways models can be coupled (Box 1). The second box will detail </w:t>
-      </w:r>
-      <w:r>
-        <w:t xml:space="preserve">the process to building a scenario framework that allows outcomes to be predicted under different heatwave scenarios and help </w:t>
-      </w:r>
-      <w:r>
-        <w:t xml:space="preserve">develop interventions </w:t>
-      </w:r>
-      <w:r>
-        <w:t>(Box 2).</w:t>
-      </w:r>
-    </w:p>
-    <w:p/>
-    <w:p>
-      <w:pPr>
+        <w:t>We will also have three figures and two boxes as part of the paper that discuss / demonstrate the following:</w:t>
+      </w:r>
+    </w:p>
+    <w:p>
+      <w:r>
         <w:rPr>
           <w:b/>
           <w:bCs/>
         </w:rPr>
-      </w:pPr>
+        <w:t>Figure 1</w:t>
+      </w:r>
+      <w:r>
+        <w:t>: Broad conceptual overview of different modelling frameworks and how they can be integrated (see above)</w:t>
+      </w:r>
+    </w:p>
+    <w:p>
       <w:r>
         <w:rPr>
           <w:b/>
           <w:bCs/>
         </w:rPr>
+        <w:t>Figure 2</w:t>
+      </w:r>
+      <w:r>
+        <w:t xml:space="preserve">: </w:t>
+      </w:r>
+    </w:p>
+    <w:p>
+      <w:r>
+        <w:rPr>
+          <w:b/>
+          <w:bCs/>
+        </w:rPr>
+        <w:t>Figure 3</w:t>
+      </w:r>
+      <w:r>
+        <w:t>:</w:t>
+      </w:r>
+    </w:p>
+    <w:p>
+      <w:r>
+        <w:rPr>
+          <w:b/>
+          <w:bCs/>
+        </w:rPr>
+        <w:t xml:space="preserve">Box </w:t>
+      </w:r>
+      <w:r>
+        <w:rPr>
+          <w:b/>
+          <w:bCs/>
+        </w:rPr>
+        <w:t>1</w:t>
+      </w:r>
+      <w:r>
+        <w:t>: B</w:t>
+      </w:r>
+      <w:r>
+        <w:t xml:space="preserve">ox </w:t>
+      </w:r>
+      <w:r>
+        <w:t xml:space="preserve">1 </w:t>
+      </w:r>
+      <w:r>
+        <w:t xml:space="preserve">will detail an example of the distinct ways models can be coupled </w:t>
+      </w:r>
+      <w:r>
+        <w:t>and used to test different scenarios and interventions</w:t>
+      </w:r>
+      <w:r>
+        <w:t xml:space="preserve">. </w:t>
+      </w:r>
+    </w:p>
+    <w:p>
+      <w:r>
+        <w:rPr>
+          <w:b/>
+          <w:bCs/>
+        </w:rPr>
+        <w:t xml:space="preserve">Box </w:t>
+      </w:r>
+      <w:r>
+        <w:rPr>
+          <w:b/>
+          <w:bCs/>
+        </w:rPr>
+        <w:t>2</w:t>
+      </w:r>
+      <w:r>
+        <w:t xml:space="preserve">: Box 2 will show how </w:t>
+      </w:r>
+      <w:r>
+        <w:t>to incorporate different environmental contexts and how plasticity and evolution can be integrated into model components.</w:t>
+      </w:r>
+    </w:p>
+    <w:p/>
+    <w:p/>
+    <w:p>
+      <w:pPr>
+        <w:rPr>
+          <w:b/>
+          <w:bCs/>
+        </w:rPr>
+      </w:pPr>
+      <w:r>
+        <w:rPr>
+          <w:b/>
+          <w:bCs/>
+        </w:rPr>
         <w:t>References</w:t>
       </w:r>
     </w:p>
@@ -775,6 +850,7 @@
     <w:p/>
     <w:p>
       <w:r>
+        <w:lastRenderedPageBreak/>
         <w:t>3</w:t>
       </w:r>
       <w:r>
@@ -856,7 +932,6 @@
         <w:rPr>
           <w:lang w:val="en-US"/>
         </w:rPr>
-        <w:lastRenderedPageBreak/>
         <w:t xml:space="preserve">5. </w:t>
       </w:r>
       <w:proofErr w:type="spellStart"/>
@@ -1894,6 +1969,7 @@
   <w:style w:type="character" w:default="1" w:styleId="DefaultParagraphFont">
     <w:name w:val="Default Paragraph Font"/>
     <w:uiPriority w:val="1"/>
+    <w:semiHidden/>
     <w:unhideWhenUsed/>
   </w:style>
   <w:style w:type="table" w:default="1" w:styleId="TableNormal">

</xml_diff>

<commit_message>
Integrate SES folks' comments
</commit_message>
<xml_diff>
--- a/ms/proposal.docx
+++ b/ms/proposal.docx
@@ -36,379 +36,141 @@
     <w:p/>
     <w:p>
       <w:r>
-        <w:t xml:space="preserve">Heatwaves are rapidly increasing in intensity and frequency globally. Extreme heatwaves will impact diverse taxa within communities with large-scale effects on community assembly and ecosystem productivity [1–3]. While we are beginning to understand how heat waves can cascade through ecosystems, a major outstanding question that remains is: How can variation in ecological responses </w:t>
-      </w:r>
-      <w:r>
-        <w:t xml:space="preserve">of organisms </w:t>
-      </w:r>
-      <w:r>
-        <w:t xml:space="preserve">to heat extremes be predicted? [4]. Tackling this question requires greater interoperability among models from diverse fields that each provide important predictive capacity </w:t>
-      </w:r>
-      <w:r>
-        <w:t>across nested hierarchies of biological scales from the subcellular to the ecosystem.</w:t>
-      </w:r>
-      <w:r>
-        <w:t xml:space="preserve"> Until now, the development of these models has largely ignored the ways in which they can ‘communicate’ and co-evolve with each other to provide a more robust systems-modelling framework. A systems-modelling approach that integrates the strengths of field-specific models will be better able to capture the diverse ways extreme heat can, and will, perturb ecological communities.  </w:t>
-      </w:r>
-    </w:p>
-    <w:p/>
-    <w:p>
-      <w:r>
-        <w:t xml:space="preserve">We propose multidisciplinary approaches combining inter-kingdom interactions and co-evolution with explicit consideration of ecophysiology, community, population and ecosystem ecology to tackle </w:t>
-      </w:r>
-      <w:r>
-        <w:t>this</w:t>
-      </w:r>
-      <w:r>
-        <w:t xml:space="preserve"> challenge. Our ideas emerged from two workshops held in 2024. Our Opinion piece will discuss our vision for an integrated quantitative modelling framework that uses models from disparate fields to calculate the effects of extreme heat on diverse organisms (microbes, plants and animals). We show how quantitative predictions that use coupled mechanistic models [biophysical models of heat and mass exchange, Dynamic Energy Budget Theory – 5–7] can be combined with physiological [e.g., thermal death time models –</w:t>
-      </w:r>
-      <w:r>
-        <w:rPr>
-          <w:rFonts w:ascii="Arial" w:hAnsi="Arial" w:cs="Arial"/>
-        </w:rPr>
-        <w:t> </w:t>
-      </w:r>
-      <w:r>
-        <w:t>e.g., 8–9] and population/community ecology models to predict systemwide perturbations of heatwave events. Importantly, we will also identify ways to incorporate recognised biological responses and environmental mediators into our proposed modelling framework (e.g., how thermal sensitivity can be mediated by microbes, water availability, plasticity and evolution). Our approach is unique in that it will provide clear connections between conceptual frameworks [e.g., 4], and the models that make quantitative predictions about how a system responds to extreme heat. Our proposed modelling framework can also be used for developing interventions that maintain resilience of biological and agricultural systems in the face of extreme heat, and we will discuss promising applications within that space. </w:t>
-      </w:r>
-    </w:p>
-    <w:p/>
-    <w:p>
-      <w:r>
-        <w:t>We outline our intended plan in more detail below along with the authorship list. While our author list is larger than typical for TREE, this piece has been developed by a large interdisciplinary group who are all actively participating in the development of this paper. Because one of the main features of this paper is to illustrate the added value of working across multiple disciplines, it is essential that we include representatives from those fields in our author list. We believe that there are now exciting, un-tapped opportunities to integrate modelling frameworks which will have implications for understanding how extreme heat impacts ecological systems, and on socioecological systems more generally. We hope that you find our proposal as exciting as we do and look forward to hearing your response. </w:t>
-      </w:r>
-    </w:p>
-    <w:p>
-      <w:r>
-        <w:t> </w:t>
-      </w:r>
-    </w:p>
-    <w:p>
-      <w:r>
-        <w:t>Sincerely,</w:t>
-      </w:r>
-      <w:r>
-        <w:rPr>
-          <w:rFonts w:ascii="Arial" w:hAnsi="Arial" w:cs="Arial"/>
-        </w:rPr>
-        <w:t>  </w:t>
-      </w:r>
-      <w:r>
-        <w:t> </w:t>
-      </w:r>
-    </w:p>
-    <w:p>
-      <w:r>
-        <w:t>Daniel Noble (on behalf of all co-authors)</w:t>
-      </w:r>
-      <w:r>
-        <w:rPr>
-          <w:rFonts w:ascii="Arial" w:hAnsi="Arial" w:cs="Arial"/>
-        </w:rPr>
-        <w:t> </w:t>
-      </w:r>
-      <w:r>
-        <w:t> </w:t>
-      </w:r>
-    </w:p>
-    <w:p/>
-    <w:p>
-      <w:pPr>
+        <w:t>Heatwaves are rapidly increasing in intensity and frequency globally. Extreme heatwaves will impact diverse taxa within communities with large-scale effects on community assembly, ecosystem productivity and the people that rely on these ecosystems</w:t>
+      </w:r>
+      <w:r>
+        <w:t xml:space="preserve"> [1–3]. </w:t>
+      </w:r>
+      <w:r>
+        <w:t xml:space="preserve">Understanding the cascading impacts across biological </w:t>
+      </w:r>
+      <w:r>
+        <w:t>and</w:t>
+      </w:r>
+      <w:r>
+        <w:t xml:space="preserve"> social systems is essential for enhancing resilience and developing management strategies.</w:t>
+      </w:r>
+      <w:r>
+        <w:t xml:space="preserve"> However</w:t>
+      </w:r>
+      <w:r>
+        <w:t xml:space="preserve">, a major outstanding question that remains is: </w:t>
+      </w:r>
+      <w:r>
         <w:rPr>
           <w:b/>
           <w:bCs/>
         </w:rPr>
-      </w:pPr>
-    </w:p>
-    <w:p>
-      <w:pPr>
+        <w:t xml:space="preserve">How can variation in ecological responses </w:t>
+      </w:r>
+      <w:r>
         <w:rPr>
           <w:b/>
           <w:bCs/>
         </w:rPr>
-      </w:pPr>
-    </w:p>
-    <w:p>
+        <w:t xml:space="preserve">of organisms </w:t>
+      </w:r>
       <w:r>
         <w:rPr>
           <w:b/>
           <w:bCs/>
         </w:rPr>
+        <w:t>to heat extremes be predicted?</w:t>
+      </w:r>
+      <w:r>
+        <w:t xml:space="preserve"> [4]. Tackling this question requires greater interoperability among models from diverse fields that each provide important predictive capacity </w:t>
+      </w:r>
+      <w:r>
+        <w:t>across nested hierarchies of biological scales from the subcellular to the ecosystem.</w:t>
+      </w:r>
+      <w:r>
+        <w:t xml:space="preserve"> Until now, the development of these models has largely ignored the ways in which they can ‘communicate’ and co-evolve with each other to provide a more robust systems-modelling framework. A systems-modelling approach that integrates the strengths of field-specific models </w:t>
+      </w:r>
+      <w:r>
+        <w:t xml:space="preserve">across scales </w:t>
+      </w:r>
+      <w:r>
+        <w:t>will be better able to capture the diverse ways extreme heat can, and will, perturb ecological communities.</w:t>
+      </w:r>
+    </w:p>
+    <w:p/>
+    <w:p>
+      <w:r>
+        <w:t xml:space="preserve">We propose multidisciplinary approaches combining inter-kingdom interactions and co-evolution with explicit consideration of ecophysiology, community, population and ecosystem ecology to tackle </w:t>
+      </w:r>
+      <w:r>
+        <w:t>this</w:t>
+      </w:r>
+      <w:r>
+        <w:t xml:space="preserve"> challenge. Our ideas emerged from two workshops held in 2024. Our Opinion piece will discuss our vision for an integrated quantitative modelling framework that uses models from disparate fields to calculate the effects of extreme heat on diverse organisms (microbes, plants and animals). We show how quantitative predictions that use coupled mechanistic models [biophysical models of heat and mass exchange, Dynamic Energy Budget Theory – 5–7] can be combined with physiological [e.g., thermal death time models –</w:t>
+      </w:r>
+      <w:r>
+        <w:rPr>
+          <w:rFonts w:ascii="Arial" w:hAnsi="Arial" w:cs="Arial"/>
+        </w:rPr>
+        <w:t> </w:t>
+      </w:r>
+      <w:r>
+        <w:t>e.g., 8–9] and population</w:t>
+      </w:r>
+      <w:r>
+        <w:t xml:space="preserve"> </w:t>
+      </w:r>
+      <w:r>
+        <w:t>/</w:t>
+      </w:r>
+      <w:r>
+        <w:t xml:space="preserve"> </w:t>
+      </w:r>
+      <w:r>
+        <w:t>community ecology models to predict systemwide perturbations of heatwave events. Importantly, we will also identify ways to incorporate recognised biological responses and environmental mediators into our proposed modelling framework (e.g., how thermal sensitivity can be mediated by microbes, water availability, plasticity and evolution). Our approach is unique in that it will provide clear connections between conceptual frameworks [e.g., 4], and the models that make quantitative predictions about how a system responds to extreme heat. Our proposed modelling framework can also be used for developing interventions that maintain resilience of biological and agricultural systems in the face of extreme heat, and we will discuss promising applications within that space. </w:t>
+      </w:r>
+      <w:r>
+        <w:t>Finally, we will discuss how these ecological models could be coupled to models of human behaviour and human dominant systems to create social-ecological models that anticipate how impacts of extreme heat on organisms could affect society.</w:t>
+      </w:r>
+    </w:p>
+    <w:p/>
+    <w:p>
+      <w:r>
+        <w:t>We outline our intended plan in more detail below along with the authorship list. While our author list is larger than typical for TREE, this piece has been developed by a large interdisciplinary group who are all actively participating in the development of this paper. Because one of the main features of this paper is to illustrate the added value of working across multiple disciplines, it is essential that we include representatives from those fields in our author list. We believe that there are now exciting, un-tapped opportunities to integrate modelling frameworks which will have implications for understanding how extreme heat impacts ecological systems</w:t>
+      </w:r>
+      <w:r>
+        <w:t>. Such an integration is a first step towards modelling</w:t>
+      </w:r>
+      <w:r>
+        <w:t xml:space="preserve"> socioecological systems more generally. We hope that you find our proposal as exciting as we do and look forward to hearing your response.</w:t>
+      </w:r>
+    </w:p>
+    <w:p/>
+    <w:p>
+      <w:r>
+        <w:t>Sincerely,</w:t>
+      </w:r>
+      <w:r>
+        <w:rPr>
+          <w:rFonts w:ascii="Arial" w:hAnsi="Arial" w:cs="Arial"/>
+        </w:rPr>
+        <w:t>  </w:t>
+      </w:r>
+      <w:r>
+        <w:t> </w:t>
+      </w:r>
+    </w:p>
+    <w:p>
+      <w:r>
         <w:lastRenderedPageBreak/>
-        <w:t>Authors</w:t>
-      </w:r>
-      <w:r>
-        <w:t>:</w:t>
-      </w:r>
-    </w:p>
-    <w:p>
-      <w:r>
-        <w:t>Daniel W.A. Noble</w:t>
-      </w:r>
-      <w:r>
-        <w:rPr>
-          <w:vertAlign w:val="superscript"/>
-        </w:rPr>
-        <w:t>1</w:t>
-      </w:r>
-      <w:r>
-        <w:t>, Micheal R. Kearney</w:t>
-      </w:r>
-      <w:r>
-        <w:rPr>
-          <w:vertAlign w:val="superscript"/>
-        </w:rPr>
-        <w:t>2</w:t>
-      </w:r>
-      <w:r>
-        <w:t>, Belinda Medlyn</w:t>
-      </w:r>
-      <w:r>
-        <w:rPr>
-          <w:vertAlign w:val="superscript"/>
-        </w:rPr>
-        <w:t>3</w:t>
-      </w:r>
-      <w:r>
-        <w:t>, Margaret Mayfield</w:t>
-      </w:r>
-      <w:r>
-        <w:rPr>
-          <w:vertAlign w:val="superscript"/>
-        </w:rPr>
-        <w:t>2</w:t>
-      </w:r>
-      <w:r>
-        <w:t>, Ary Hoffmann</w:t>
-      </w:r>
-      <w:r>
-        <w:rPr>
-          <w:vertAlign w:val="superscript"/>
-        </w:rPr>
-        <w:t>1</w:t>
-      </w:r>
-      <w:r>
-        <w:t>, James Cook</w:t>
-      </w:r>
-      <w:r>
-        <w:rPr>
-          <w:vertAlign w:val="superscript"/>
-        </w:rPr>
-        <w:t>3</w:t>
-      </w:r>
-      <w:r>
-        <w:t>, Brajesh Singh</w:t>
-      </w:r>
-      <w:r>
-        <w:rPr>
-          <w:vertAlign w:val="superscript"/>
-        </w:rPr>
-        <w:t>3</w:t>
-      </w:r>
-      <w:r>
-        <w:t>, Adrienne Nicotra</w:t>
-      </w:r>
-      <w:r>
-        <w:rPr>
-          <w:vertAlign w:val="superscript"/>
-        </w:rPr>
-        <w:t>1,4</w:t>
-      </w:r>
-      <w:r>
-        <w:t>, Brendan Choat</w:t>
-      </w:r>
-      <w:r>
-        <w:rPr>
-          <w:vertAlign w:val="superscript"/>
-        </w:rPr>
-        <w:t>3</w:t>
-      </w:r>
-      <w:r>
-        <w:t>, Owen Atkin</w:t>
-      </w:r>
-      <w:r>
-        <w:rPr>
-          <w:vertAlign w:val="superscript"/>
-        </w:rPr>
-        <w:t>4</w:t>
-      </w:r>
-      <w:r>
-        <w:t>, Barry Pogson</w:t>
-      </w:r>
-      <w:r>
-        <w:rPr>
-          <w:vertAlign w:val="superscript"/>
-        </w:rPr>
-        <w:t>4</w:t>
-      </w:r>
-      <w:r>
-        <w:t>, Danielle Way</w:t>
-      </w:r>
-      <w:r>
-        <w:rPr>
-          <w:vertAlign w:val="superscript"/>
-        </w:rPr>
-        <w:t>4</w:t>
-      </w:r>
-      <w:r>
-        <w:t>, Alison Bentley</w:t>
-      </w:r>
-      <w:r>
-        <w:rPr>
-          <w:vertAlign w:val="superscript"/>
-        </w:rPr>
-        <w:t>4</w:t>
-      </w:r>
-      <w:r>
-        <w:t>, Ian Wright</w:t>
-      </w:r>
-      <w:r>
-        <w:rPr>
-          <w:vertAlign w:val="superscript"/>
-        </w:rPr>
-        <w:t>3</w:t>
-      </w:r>
-      <w:r>
-        <w:t xml:space="preserve">, </w:t>
-      </w:r>
-      <w:proofErr w:type="spellStart"/>
-      <w:r>
-        <w:t>Xuemei</w:t>
-      </w:r>
-      <w:proofErr w:type="spellEnd"/>
-      <w:r>
-        <w:t xml:space="preserve"> Bai</w:t>
-      </w:r>
-      <w:r>
-        <w:rPr>
-          <w:vertAlign w:val="superscript"/>
-        </w:rPr>
-        <w:t>5</w:t>
-      </w:r>
-      <w:r>
-        <w:t>, Zhong</w:t>
-      </w:r>
-      <w:r>
-        <w:t>-H</w:t>
-      </w:r>
-      <w:r>
-        <w:t>ua Chen</w:t>
-      </w:r>
-      <w:r>
-        <w:rPr>
-          <w:vertAlign w:val="superscript"/>
-        </w:rPr>
-        <w:t>3</w:t>
-      </w:r>
-      <w:r>
-        <w:t>, Steven Lade</w:t>
-      </w:r>
-      <w:r>
-        <w:rPr>
-          <w:vertAlign w:val="superscript"/>
-        </w:rPr>
-        <w:t>5</w:t>
-      </w:r>
-      <w:r>
-        <w:t xml:space="preserve"> </w:t>
-      </w:r>
-    </w:p>
-    <w:p>
-      <w:r>
-        <w:t xml:space="preserve"> </w:t>
-      </w:r>
-    </w:p>
-    <w:p>
-      <w:r>
-        <w:t xml:space="preserve">Affiliations: </w:t>
-      </w:r>
-    </w:p>
-    <w:p>
-      <w:r>
-        <w:rPr>
-          <w:vertAlign w:val="superscript"/>
-        </w:rPr>
-        <w:t>1</w:t>
-      </w:r>
-      <w:r>
-        <w:t xml:space="preserve"> </w:t>
-      </w:r>
-      <w:r>
-        <w:t xml:space="preserve">Division of Ecology and Evolution, Research School of Biology, The Australian National University, Canberra ACT 2602, Australia  </w:t>
-      </w:r>
-      <w:r>
-        <w:t xml:space="preserve"> </w:t>
-      </w:r>
-    </w:p>
-    <w:p>
-      <w:r>
-        <w:rPr>
-          <w:vertAlign w:val="superscript"/>
-        </w:rPr>
-        <w:t>2</w:t>
-      </w:r>
-      <w:r>
-        <w:t xml:space="preserve"> School of Biosciences, The University of Melbourne</w:t>
-      </w:r>
-      <w:r>
-        <w:t>, Australia.</w:t>
-      </w:r>
-      <w:r>
-        <w:t xml:space="preserve"> </w:t>
-      </w:r>
-    </w:p>
-    <w:p>
-      <w:r>
-        <w:rPr>
-          <w:vertAlign w:val="superscript"/>
-        </w:rPr>
-        <w:t>3</w:t>
-      </w:r>
-      <w:r>
-        <w:t xml:space="preserve"> Hawksbury Institute for the Environment, Western Sydney University</w:t>
-      </w:r>
-      <w:r>
-        <w:t>, Australia.</w:t>
-      </w:r>
-      <w:r>
-        <w:t xml:space="preserve"> </w:t>
-      </w:r>
-    </w:p>
-    <w:p>
-      <w:r>
-        <w:rPr>
-          <w:vertAlign w:val="superscript"/>
-        </w:rPr>
-        <w:t>4</w:t>
-      </w:r>
-      <w:r>
-        <w:t xml:space="preserve"> Division of Plant Sciences, Research School of Biology, The Australian National University, Canberra ACT 2602</w:t>
-      </w:r>
-      <w:r>
-        <w:t>, Australia.</w:t>
-      </w:r>
-      <w:r>
-        <w:t xml:space="preserve"> </w:t>
-      </w:r>
-    </w:p>
-    <w:p>
-      <w:r>
-        <w:rPr>
-          <w:vertAlign w:val="superscript"/>
-        </w:rPr>
-        <w:t>5</w:t>
-      </w:r>
-      <w:r>
-        <w:t xml:space="preserve"> Fenner School of Environment and Society, The Australian National University, Canberra ACT 2602</w:t>
-      </w:r>
-      <w:r>
-        <w:t>, Australia.</w:t>
-      </w:r>
-      <w:r>
-        <w:t xml:space="preserve"> </w:t>
-      </w:r>
-    </w:p>
-    <w:p/>
+        <w:t>Daniel Noble (on behalf of all co-authors)</w:t>
+      </w:r>
+      <w:r>
+        <w:rPr>
+          <w:rFonts w:ascii="Arial" w:hAnsi="Arial" w:cs="Arial"/>
+        </w:rPr>
+        <w:t> </w:t>
+      </w:r>
+      <w:r>
+        <w:t> </w:t>
+      </w:r>
+    </w:p>
     <w:p>
       <w:pPr>
         <w:rPr>
@@ -416,45 +178,284 @@
           <w:bCs/>
         </w:rPr>
       </w:pPr>
+    </w:p>
+    <w:p>
       <w:r>
         <w:rPr>
           <w:b/>
           <w:bCs/>
         </w:rPr>
-        <w:t>Abstract</w:t>
-      </w:r>
-    </w:p>
-    <w:p>
-      <w:pPr>
-        <w:rPr>
-          <w:rFonts w:ascii="Arial" w:hAnsi="Arial" w:cs="Arial"/>
-        </w:rPr>
-      </w:pPr>
-      <w:r>
-        <w:rPr>
-          <w:lang w:val="en-US"/>
-        </w:rPr>
-        <w:t>Anthropogenic climate change is leading to more frequent and extreme heat waves. These short-term but large-scale events are radically re-shaping interactions among organisms, impacting biodiversity, community composition and ecosystem services crucial to natural systems and food security. Predicting heat wave impacts on interacting species requires an understanding of the processes driving differential exposure and sensitivity of organisms to extreme heat events in a life-cycle context. But this, in turn, requires a modelling framework that can capture species-specific responses via habitat-mediated microclimates, biophysics of body temperature, physiological sensitivity, and its effects on vital rates across ontogeny and thermal history. We show how existing models in disparate fields can be linked to achieve this level of understanding to allow for calculated responses to extreme heat now and into the future</w:t>
-      </w:r>
-      <w:r>
-        <w:rPr>
-          <w:lang w:val="en-US"/>
-        </w:rPr>
-        <w:t xml:space="preserve"> and explore implications for socioecological systems</w:t>
-      </w:r>
-      <w:r>
-        <w:rPr>
-          <w:lang w:val="en-US"/>
-        </w:rPr>
-        <w:t>.</w:t>
-      </w:r>
-      <w:r>
-        <w:rPr>
-          <w:rFonts w:ascii="Arial" w:hAnsi="Arial" w:cs="Arial"/>
-        </w:rPr>
-        <w:t> </w:t>
-      </w:r>
-    </w:p>
+        <w:t>Authors</w:t>
+      </w:r>
+      <w:r>
+        <w:t>:</w:t>
+      </w:r>
+    </w:p>
+    <w:p>
+      <w:r>
+        <w:t>Daniel W.A. Noble</w:t>
+      </w:r>
+      <w:r>
+        <w:rPr>
+          <w:vertAlign w:val="superscript"/>
+        </w:rPr>
+        <w:t>1</w:t>
+      </w:r>
+      <w:r>
+        <w:t>, Micheal R. Kearney</w:t>
+      </w:r>
+      <w:r>
+        <w:rPr>
+          <w:vertAlign w:val="superscript"/>
+        </w:rPr>
+        <w:t>2</w:t>
+      </w:r>
+      <w:r>
+        <w:t>, Belinda Medlyn</w:t>
+      </w:r>
+      <w:r>
+        <w:rPr>
+          <w:vertAlign w:val="superscript"/>
+        </w:rPr>
+        <w:t>3</w:t>
+      </w:r>
+      <w:r>
+        <w:t>, Margaret Mayfield</w:t>
+      </w:r>
+      <w:r>
+        <w:rPr>
+          <w:vertAlign w:val="superscript"/>
+        </w:rPr>
+        <w:t>2</w:t>
+      </w:r>
+      <w:r>
+        <w:t>, Ary Hoffmann</w:t>
+      </w:r>
+      <w:r>
+        <w:rPr>
+          <w:vertAlign w:val="superscript"/>
+        </w:rPr>
+        <w:t>1</w:t>
+      </w:r>
+      <w:r>
+        <w:t>, James Cook</w:t>
+      </w:r>
+      <w:r>
+        <w:rPr>
+          <w:vertAlign w:val="superscript"/>
+        </w:rPr>
+        <w:t>3</w:t>
+      </w:r>
+      <w:r>
+        <w:t>, Brajesh Singh</w:t>
+      </w:r>
+      <w:r>
+        <w:rPr>
+          <w:vertAlign w:val="superscript"/>
+        </w:rPr>
+        <w:t>3</w:t>
+      </w:r>
+      <w:r>
+        <w:t>, Adrienne Nicotra</w:t>
+      </w:r>
+      <w:r>
+        <w:rPr>
+          <w:vertAlign w:val="superscript"/>
+        </w:rPr>
+        <w:t>1,4</w:t>
+      </w:r>
+      <w:r>
+        <w:t>, Brendan Choat</w:t>
+      </w:r>
+      <w:r>
+        <w:rPr>
+          <w:vertAlign w:val="superscript"/>
+        </w:rPr>
+        <w:t>3</w:t>
+      </w:r>
+      <w:r>
+        <w:t>, Owen Atkin</w:t>
+      </w:r>
+      <w:r>
+        <w:rPr>
+          <w:vertAlign w:val="superscript"/>
+        </w:rPr>
+        <w:t>4</w:t>
+      </w:r>
+      <w:r>
+        <w:t>, Barry Pogson</w:t>
+      </w:r>
+      <w:r>
+        <w:rPr>
+          <w:vertAlign w:val="superscript"/>
+        </w:rPr>
+        <w:t>4</w:t>
+      </w:r>
+      <w:r>
+        <w:t>, Danielle Way</w:t>
+      </w:r>
+      <w:r>
+        <w:rPr>
+          <w:vertAlign w:val="superscript"/>
+        </w:rPr>
+        <w:t>4</w:t>
+      </w:r>
+      <w:r>
+        <w:t>, Alison Bentley</w:t>
+      </w:r>
+      <w:r>
+        <w:rPr>
+          <w:vertAlign w:val="superscript"/>
+        </w:rPr>
+        <w:t>4</w:t>
+      </w:r>
+      <w:r>
+        <w:t>, Ian Wright</w:t>
+      </w:r>
+      <w:r>
+        <w:rPr>
+          <w:vertAlign w:val="superscript"/>
+        </w:rPr>
+        <w:t>3</w:t>
+      </w:r>
+      <w:r>
+        <w:t>, Zhong</w:t>
+      </w:r>
+      <w:r>
+        <w:t>-H</w:t>
+      </w:r>
+      <w:r>
+        <w:t>ua Chen</w:t>
+      </w:r>
+      <w:r>
+        <w:rPr>
+          <w:vertAlign w:val="superscript"/>
+        </w:rPr>
+        <w:t>3</w:t>
+      </w:r>
+      <w:r>
+        <w:t>, Steven Lade</w:t>
+      </w:r>
+      <w:r>
+        <w:rPr>
+          <w:vertAlign w:val="superscript"/>
+        </w:rPr>
+        <w:t>5</w:t>
+      </w:r>
+      <w:r>
+        <w:t xml:space="preserve">, </w:t>
+      </w:r>
+      <w:proofErr w:type="spellStart"/>
+      <w:r>
+        <w:t>Xuemei</w:t>
+      </w:r>
+      <w:proofErr w:type="spellEnd"/>
+      <w:r>
+        <w:t xml:space="preserve"> Bai</w:t>
+      </w:r>
+      <w:r>
+        <w:rPr>
+          <w:vertAlign w:val="superscript"/>
+        </w:rPr>
+        <w:t>5</w:t>
+      </w:r>
+    </w:p>
+    <w:p>
+      <w:r>
+        <w:t xml:space="preserve"> </w:t>
+      </w:r>
+    </w:p>
+    <w:p>
+      <w:r>
+        <w:t xml:space="preserve">Affiliations: </w:t>
+      </w:r>
+    </w:p>
+    <w:p>
+      <w:r>
+        <w:rPr>
+          <w:vertAlign w:val="superscript"/>
+        </w:rPr>
+        <w:t>1</w:t>
+      </w:r>
+      <w:r>
+        <w:t xml:space="preserve"> </w:t>
+      </w:r>
+      <w:r>
+        <w:t xml:space="preserve">Division of Ecology and Evolution, Research School of Biology, The Australian National University, Canberra ACT 2602, Australia  </w:t>
+      </w:r>
+      <w:r>
+        <w:t xml:space="preserve"> </w:t>
+      </w:r>
+    </w:p>
+    <w:p>
+      <w:r>
+        <w:rPr>
+          <w:vertAlign w:val="superscript"/>
+        </w:rPr>
+        <w:t>2</w:t>
+      </w:r>
+      <w:r>
+        <w:t xml:space="preserve"> School of Biosciences, The University of Melbourne</w:t>
+      </w:r>
+      <w:r>
+        <w:t>, Australia.</w:t>
+      </w:r>
+      <w:r>
+        <w:t xml:space="preserve"> </w:t>
+      </w:r>
+    </w:p>
+    <w:p>
+      <w:r>
+        <w:rPr>
+          <w:vertAlign w:val="superscript"/>
+        </w:rPr>
+        <w:t>3</w:t>
+      </w:r>
+      <w:r>
+        <w:t xml:space="preserve"> Hawksbury Institute for the Environment, Western Sydney University</w:t>
+      </w:r>
+      <w:r>
+        <w:t>, Australia.</w:t>
+      </w:r>
+      <w:r>
+        <w:t xml:space="preserve"> </w:t>
+      </w:r>
+    </w:p>
+    <w:p>
+      <w:r>
+        <w:rPr>
+          <w:vertAlign w:val="superscript"/>
+        </w:rPr>
+        <w:t>4</w:t>
+      </w:r>
+      <w:r>
+        <w:t xml:space="preserve"> Division of Plant Sciences, Research School of Biology, The Australian National University, Canberra ACT 2602</w:t>
+      </w:r>
+      <w:r>
+        <w:t>, Australia.</w:t>
+      </w:r>
+      <w:r>
+        <w:t xml:space="preserve"> </w:t>
+      </w:r>
+    </w:p>
+    <w:p>
+      <w:r>
+        <w:rPr>
+          <w:vertAlign w:val="superscript"/>
+        </w:rPr>
+        <w:t>5</w:t>
+      </w:r>
+      <w:r>
+        <w:t xml:space="preserve"> Fenner School of Environment and Society, The Australian National University, Canberra ACT 2602</w:t>
+      </w:r>
+      <w:r>
+        <w:t>, Australia.</w:t>
+      </w:r>
+      <w:r>
+        <w:t xml:space="preserve"> </w:t>
+      </w:r>
+    </w:p>
+    <w:p/>
     <w:p>
       <w:pPr>
         <w:rPr>
@@ -462,9 +463,56 @@
           <w:bCs/>
         </w:rPr>
       </w:pPr>
-    </w:p>
-    <w:p>
-      <w:pPr>
+      <w:r>
+        <w:rPr>
+          <w:b/>
+          <w:bCs/>
+        </w:rPr>
+        <w:t>Abstract</w:t>
+      </w:r>
+    </w:p>
+    <w:p>
+      <w:pPr>
+        <w:rPr>
+          <w:rFonts w:ascii="Arial" w:hAnsi="Arial" w:cs="Arial"/>
+        </w:rPr>
+      </w:pPr>
+      <w:r>
+        <w:rPr>
+          <w:lang w:val="en-US"/>
+        </w:rPr>
+        <w:t>Anthropogenic climate change is leading to more frequent and extreme heat waves. These short-term but large-scale events are radically re-shaping interactions among organisms, impacting biodiversity, community composition and ecosystem services crucial to natural systems and food security. Predicting heat wave impacts on interacting species requires an understanding of the processes driving differential exposure and sensitivity of organisms to extreme heat events in a life-cycle context. But this, in turn, requires a modelling framework that can capture species-specific responses via habitat-mediated microclimates, biophysics of body temperature, physiological sensitivity, and its effects on vital rates across ontogeny and thermal history. We show how existing models in disparate fields can be linked to achieve this level of understanding to allow for calculated responses to extreme heat now and into the future</w:t>
+      </w:r>
+      <w:r>
+        <w:rPr>
+          <w:lang w:val="en-US"/>
+        </w:rPr>
+        <w:t xml:space="preserve"> and explore implications for socioecological systems</w:t>
+      </w:r>
+      <w:r>
+        <w:rPr>
+          <w:lang w:val="en-US"/>
+        </w:rPr>
+        <w:t>.</w:t>
+      </w:r>
+      <w:r>
+        <w:rPr>
+          <w:rFonts w:ascii="Arial" w:hAnsi="Arial" w:cs="Arial"/>
+        </w:rPr>
+        <w:t> </w:t>
+      </w:r>
+    </w:p>
+    <w:p>
+      <w:pPr>
+        <w:rPr>
+          <w:b/>
+          <w:bCs/>
+        </w:rPr>
+      </w:pPr>
+    </w:p>
+    <w:p>
+      <w:pPr>
+        <w:jc w:val="center"/>
         <w:rPr>
           <w:b/>
           <w:bCs/>
@@ -477,9 +525,9 @@
           <w:noProof/>
         </w:rPr>
         <w:drawing>
-          <wp:inline distT="0" distB="0" distL="0" distR="0" wp14:anchorId="615BDD5E" wp14:editId="7279A6A9">
-            <wp:extent cx="6029325" cy="4220764"/>
-            <wp:effectExtent l="0" t="0" r="3175" b="0"/>
+          <wp:inline distT="0" distB="0" distL="0" distR="0" wp14:anchorId="615BDD5E" wp14:editId="68B71CEE">
+            <wp:extent cx="5400675" cy="3780685"/>
+            <wp:effectExtent l="0" t="0" r="0" b="4445"/>
             <wp:docPr id="1919147103" name="Picture 1" descr="A diagram of a plant&#10;&#10;Description automatically generated"/>
             <wp:cNvGraphicFramePr>
               <a:graphicFrameLocks xmlns:a="http://schemas.openxmlformats.org/drawingml/2006/main" noChangeAspect="1"/>
@@ -506,7 +554,7 @@
                   <pic:spPr>
                     <a:xfrm>
                       <a:off x="0" y="0"/>
-                      <a:ext cx="6047738" cy="4233654"/>
+                      <a:ext cx="5449079" cy="3814570"/>
                     </a:xfrm>
                     <a:prstGeom prst="rect">
                       <a:avLst/>
@@ -716,6 +764,18 @@
         </w:numPr>
       </w:pPr>
       <w:r>
+        <w:t xml:space="preserve">Interacting species interacting with people: social-ecological systems </w:t>
+      </w:r>
+    </w:p>
+    <w:p>
+      <w:pPr>
+        <w:pStyle w:val="ListParagraph"/>
+        <w:numPr>
+          <w:ilvl w:val="0"/>
+          <w:numId w:val="1"/>
+        </w:numPr>
+      </w:pPr>
+      <w:r>
         <w:t>Future directions: modelling challenges, gaps and possible solutions</w:t>
       </w:r>
     </w:p>
@@ -908,6 +968,7 @@
     <w:p/>
     <w:p>
       <w:r>
+        <w:lastRenderedPageBreak/>
         <w:t>3</w:t>
       </w:r>
       <w:r>
@@ -2026,7 +2087,6 @@
   <w:style w:type="character" w:default="1" w:styleId="DefaultParagraphFont">
     <w:name w:val="Default Paragraph Font"/>
     <w:uiPriority w:val="1"/>
-    <w:semiHidden/>
     <w:unhideWhenUsed/>
   </w:style>
   <w:style w:type="table" w:default="1" w:styleId="TableNormal">

</xml_diff>

<commit_message>
Update proposal with ecology refs
</commit_message>
<xml_diff>
--- a/ms/proposal.docx
+++ b/ms/proposal.docx
@@ -123,7 +123,19 @@
         <w:t xml:space="preserve"> </w:t>
       </w:r>
       <w:r>
-        <w:t>community ecology models to predict systemwide perturbations of heatwave events. Importantly, we will also identify ways to incorporate recognised biological responses and environmental mediators into our proposed modelling framework (e.g., how thermal sensitivity can be mediated by microbes, water availability, plasticity and evolution). Our approach is unique in that it will provide clear connections between conceptual frameworks [e.g., 4], and the models that make quantitative predictions about how a system responds to extreme heat. Our proposed modelling framework can also be used for developing interventions that maintain resilience of biological and agricultural systems in the face of extreme heat, and we will discuss promising applications within that space. </w:t>
+        <w:t xml:space="preserve">community ecology models </w:t>
+      </w:r>
+      <w:r>
+        <w:t>[e.g., 10-</w:t>
+      </w:r>
+      <w:r>
+        <w:t>12</w:t>
+      </w:r>
+      <w:r>
+        <w:t xml:space="preserve">] </w:t>
+      </w:r>
+      <w:r>
+        <w:t>to predict systemwide perturbations of heatwave events. Importantly, we will also identify ways to incorporate recognised biological responses and environmental mediators into our proposed modelling framework (e.g., how thermal sensitivity can be mediated by microbes, water availability, plasticity and evolution). Our approach is unique in that it will provide clear connections between conceptual frameworks [e.g., 4], and the models that make quantitative predictions about how a system responds to extreme heat. Our proposed modelling framework can also be used for developing interventions that maintain resilience of biological and agricultural systems in the face of extreme heat, and we will discuss promising applications within that space. </w:t>
       </w:r>
       <w:r>
         <w:t>Finally, we will discuss how these ecological models could be coupled to models of human behaviour and human dominant systems to create social-ecological models that anticipate how impacts of extreme heat on organisms could affect society.</w:t>
@@ -158,7 +170,6 @@
     </w:p>
     <w:p>
       <w:r>
-        <w:lastRenderedPageBreak/>
         <w:t>Daniel Noble (on behalf of all co-authors)</w:t>
       </w:r>
       <w:r>
@@ -172,19 +183,12 @@
       </w:r>
     </w:p>
     <w:p>
-      <w:pPr>
+      <w:r>
         <w:rPr>
           <w:b/>
           <w:bCs/>
         </w:rPr>
-      </w:pPr>
-    </w:p>
-    <w:p>
-      <w:r>
-        <w:rPr>
-          <w:b/>
-          <w:bCs/>
-        </w:rPr>
+        <w:lastRenderedPageBreak/>
         <w:t>Authors</w:t>
       </w:r>
       <w:r>
@@ -573,7 +577,6 @@
           <w:b/>
           <w:bCs/>
         </w:rPr>
-        <w:lastRenderedPageBreak/>
         <w:t>Figure</w:t>
       </w:r>
       <w:r>
@@ -587,7 +590,11 @@
         <w:t xml:space="preserve">: </w:t>
       </w:r>
       <w:r>
-        <w:t>The proposed modelling integration developed in our Opinion paper that integrates climate/biophysical models to predict exposure temperatures of species within communities. Exposure temperatures provide inputs for damage-repair and dynamic energy budget models that integrate temperature exposure with explicit physiological models that simulate development, behaviour, survival and reproduction in response to temperature across ontogeny. Physiological models can be built around the unique life cycles of the diverse species in communities capturing lagged responses to extreme heat, phenological mismatches and mechanistically informed responses to extreme heat for species of the system in question. Outputs (behaviour, survival, reproduction) from physiological models can then be integrated into population and community ecology models to predict population growth and community interactions for a given system change. We show how key environmental mediators feedback to influence exposure and sensitivity (e.g., water availability, microbiota) to influence different life stages and organs. The integration of existing models in this novel way to functional guilds allow simulations of whole communities. It will allow us to make quantitative predictions for system perturbations and implement localised solutions that can have system-wide effects on resilience to extreme heat. </w:t>
+        <w:t xml:space="preserve">The proposed modelling integration developed in our Opinion paper that integrates climate/biophysical models to predict exposure temperatures of species within communities. Exposure temperatures provide inputs for damage-repair and dynamic energy budget models that integrate temperature exposure with explicit physiological models that simulate development, </w:t>
+      </w:r>
+      <w:r>
+        <w:lastRenderedPageBreak/>
+        <w:t>behaviour, survival and reproduction in response to temperature across ontogeny. Physiological models can be built around the unique life cycles of the diverse species in communities capturing lagged responses to extreme heat, phenological mismatches and mechanistically informed responses to extreme heat for species of the system in question. Outputs (behaviour, survival, reproduction) from physiological models can then be integrated into population and community ecology models to predict population growth and community interactions for a given system change. We show how key environmental mediators feedback to influence exposure and sensitivity (e.g., water availability, microbiota) to influence different life stages and organs. The integration of existing models in this novel way to functional guilds allow simulations of whole communities. It will allow us to make quantitative predictions for system perturbations and implement localised solutions that can have system-wide effects on resilience to extreme heat. </w:t>
       </w:r>
     </w:p>
     <w:p>
@@ -968,7 +975,6 @@
     <w:p/>
     <w:p>
       <w:r>
-        <w:lastRenderedPageBreak/>
         <w:t>3</w:t>
       </w:r>
       <w:r>
@@ -1050,6 +1056,7 @@
         <w:rPr>
           <w:lang w:val="en-US"/>
         </w:rPr>
+        <w:lastRenderedPageBreak/>
         <w:t xml:space="preserve">5. </w:t>
       </w:r>
       <w:proofErr w:type="spellStart"/>
@@ -1359,9 +1366,117 @@
       </w:r>
     </w:p>
     <w:p/>
+    <w:p>
+      <w:pPr>
+        <w:pStyle w:val="Bibliography"/>
+      </w:pPr>
+      <w:r>
+        <w:t xml:space="preserve">10. </w:t>
+      </w:r>
+      <w:r>
+        <w:t xml:space="preserve">Delmas, E. </w:t>
+      </w:r>
+      <w:r>
+        <w:rPr>
+          <w:i/>
+          <w:iCs/>
+        </w:rPr>
+        <w:t>et al.</w:t>
+      </w:r>
+      <w:r>
+        <w:t xml:space="preserve"> (2019) Analysing ecological networks of species interactions. </w:t>
+      </w:r>
+      <w:r>
+        <w:rPr>
+          <w:i/>
+          <w:iCs/>
+        </w:rPr>
+        <w:t>Biological Reviews</w:t>
+      </w:r>
+      <w:r>
+        <w:t xml:space="preserve"> 94, 16–36</w:t>
+      </w:r>
+    </w:p>
+    <w:p/>
+    <w:p>
+      <w:r>
+        <w:t xml:space="preserve">11. </w:t>
+      </w:r>
+      <w:r>
+        <w:t xml:space="preserve">Carrara, F. </w:t>
+      </w:r>
+      <w:r>
+        <w:rPr>
+          <w:i/>
+          <w:iCs/>
+        </w:rPr>
+        <w:t>et al.</w:t>
+      </w:r>
+      <w:r>
+        <w:t xml:space="preserve"> (2015) Inferring species interactions in ecological communities: A comparison of methods at different levels of complexity. </w:t>
+      </w:r>
+      <w:r>
+        <w:rPr>
+          <w:i/>
+          <w:iCs/>
+        </w:rPr>
+        <w:t>Methods in Ecology and Evolution</w:t>
+      </w:r>
+      <w:r>
+        <w:t xml:space="preserve"> 6, 895–906</w:t>
+      </w:r>
+    </w:p>
+    <w:p/>
+    <w:p>
+      <w:pPr>
+        <w:pStyle w:val="Bibliography"/>
+      </w:pPr>
+      <w:r>
+        <w:t xml:space="preserve">12. </w:t>
+      </w:r>
+      <w:r>
+        <w:t xml:space="preserve">Weiss-Lehman, C.P. </w:t>
+      </w:r>
+      <w:r>
+        <w:rPr>
+          <w:i/>
+          <w:iCs/>
+        </w:rPr>
+        <w:t>et al.</w:t>
+      </w:r>
+      <w:r>
+        <w:t xml:space="preserve"> (2022) Disentangling key species interactions in diverse and heterogeneous communities: A </w:t>
+      </w:r>
+      <w:proofErr w:type="spellStart"/>
+      <w:r>
+        <w:t>bayesian</w:t>
+      </w:r>
+      <w:proofErr w:type="spellEnd"/>
+      <w:r>
+        <w:t xml:space="preserve"> sparse modelling approach. </w:t>
+      </w:r>
+      <w:r>
+        <w:rPr>
+          <w:i/>
+          <w:iCs/>
+        </w:rPr>
+        <w:t>Ecology Letters</w:t>
+      </w:r>
+      <w:r>
+        <w:t xml:space="preserve"> 25, 1263–1276</w:t>
+      </w:r>
+    </w:p>
+    <w:p>
+      <w:pPr>
+        <w:rPr>
+          <w:b/>
+          <w:bCs/>
+        </w:rPr>
+      </w:pPr>
+    </w:p>
     <w:sectPr>
       <w:pgSz w:w="11900" w:h="16840"/>
-      <w:pgMar w:top="851" w:right="851" w:bottom="851" w:left="851" w:header="709" w:footer="709" w:gutter="0"/>
+      <w:pgMar w:top="680" w:right="851" w:bottom="680" w:left="851" w:header="709" w:footer="709" w:gutter="0"/>
       <w:cols w:space="708"/>
       <w:docGrid w:linePitch="360"/>
     </w:sectPr>
@@ -2087,6 +2202,7 @@
   <w:style w:type="character" w:default="1" w:styleId="DefaultParagraphFont">
     <w:name w:val="Default Paragraph Font"/>
     <w:uiPriority w:val="1"/>
+    <w:semiHidden/>
     <w:unhideWhenUsed/>
   </w:style>
   <w:style w:type="table" w:default="1" w:styleId="TableNormal">

</xml_diff>